<commit_message>
Add diploma document with custom formatting and frames
Update metadata and create a Word document with GOST-style frames, stamp, and specific formatting for a diploma, replacing previous content.

Replit-Commit-Author: Agent
Replit-Commit-Session-Id: d1abefa3-a3f4-4e72-a882-36602e48f1c1
Replit-Commit-Checkpoint-Type: full_checkpoint
Replit-Commit-Event-Id: c7b3bf7a-d730-4fa1-abf0-8e7bd066f279
Replit-Commit-Screenshot-Url: https://storage.googleapis.com/screenshot-production-us-central1/eab40536-890d-4edc-a000-c767b2eebd09/d1abefa3-a3f4-4e72-a882-36602e48f1c1/W8e3DTc
Replit-Helium-Checkpoint-Created: true
</commit_message>
<xml_diff>
--- a/CodePath_Пояснительная_записка.docx
+++ b/CodePath_Пояснительная_записка.docx
@@ -55,6 +55,9 @@
       </w:r>
     </w:p>
     <w:p>
+      <w:pPr>
+        <w:ind w:left="567"/>
+      </w:pPr>
       <w:r>
         <w:rPr>
           <w:rFonts w:ascii="Times New Roman" w:hAnsi="Times New Roman"/>
@@ -74,6 +77,9 @@
       </w:r>
     </w:p>
     <w:p>
+      <w:pPr>
+        <w:ind w:left="567"/>
+      </w:pPr>
       <w:r>
         <w:rPr>
           <w:rFonts w:ascii="Times New Roman" w:hAnsi="Times New Roman"/>
@@ -93,6 +99,9 @@
       </w:r>
     </w:p>
     <w:p>
+      <w:pPr>
+        <w:ind w:left="567"/>
+      </w:pPr>
       <w:r>
         <w:rPr>
           <w:rFonts w:ascii="Times New Roman" w:hAnsi="Times New Roman"/>
@@ -131,6 +140,9 @@
       </w:r>
     </w:p>
     <w:p>
+      <w:pPr>
+        <w:ind w:left="567"/>
+      </w:pPr>
       <w:r>
         <w:rPr>
           <w:rFonts w:ascii="Times New Roman" w:hAnsi="Times New Roman"/>
@@ -150,6 +162,9 @@
       </w:r>
     </w:p>
     <w:p>
+      <w:pPr>
+        <w:ind w:left="567"/>
+      </w:pPr>
       <w:r>
         <w:rPr>
           <w:rFonts w:ascii="Times New Roman" w:hAnsi="Times New Roman"/>
@@ -232,6 +247,9 @@
       </w:r>
     </w:p>
     <w:p>
+      <w:pPr>
+        <w:ind w:left="567"/>
+      </w:pPr>
       <w:r>
         <w:rPr>
           <w:rFonts w:ascii="Times New Roman" w:hAnsi="Times New Roman"/>
@@ -251,6 +269,9 @@
       </w:r>
     </w:p>
     <w:p>
+      <w:pPr>
+        <w:ind w:left="567"/>
+      </w:pPr>
       <w:r>
         <w:rPr>
           <w:rFonts w:ascii="Times New Roman" w:hAnsi="Times New Roman"/>
@@ -270,6 +291,9 @@
       </w:r>
     </w:p>
     <w:p>
+      <w:pPr>
+        <w:ind w:left="567"/>
+      </w:pPr>
       <w:r>
         <w:rPr>
           <w:rFonts w:ascii="Times New Roman" w:hAnsi="Times New Roman"/>
@@ -945,7 +969,7 @@
           <w:i/>
           <w:sz w:val="24"/>
         </w:rPr>
-        <w:t>Рисунок 1 - Общий вид контекстной диаграммы IDEF0</w:t>
+        <w:t>Рисунок 1 – Общий вид контекстной диаграммы IDEF0</w:t>
       </w:r>
     </w:p>
     <w:p>
@@ -1135,7 +1159,7 @@
           <w:rFonts w:ascii="Times New Roman" w:hAnsi="Times New Roman"/>
           <w:sz w:val="28"/>
         </w:rPr>
-        <w:t>В ходе разработки система была разделена на логические модули: модуль аутентификации и сессий (регистрация, вход, JWT-токены), модуль профиля и настроек, модуль курсов и уроков (каталог, запись, прохождение), модуль квизов (вопросы, варианты ответов, проверка), модуль практических заданий (редактор кода, выполнение, проверка через тест-кейсы), модуль геймификации (XP, уровни, серии, достижения, таблица лидеров), а также административный модуль (управление контентом и пользователями). Такой подход позволяет изолировать ответственность компонентов и упрощает дальнейшее расширение функционала — например, добавление новых языков программирования, более глубоких аналитических отчётов и персонализированных рекомендаций.</w:t>
+        <w:t>В ходе разработки система была разделена на логические модули: модуль аутентификации и сессий (регистрация, вход, JWT-токены), модуль профиля и настроек, модуль курсов и уроков (каталог, запись, прохождение), модуль квизов (вопросы, варианты ответов, проверка), модуль практических заданий (редактор кода, выполнение, проверка через тест-кейсы), модуль геймификации (XP, уровни, серии, достижения, таблица лидеров), а также административный модуль (управление контентом и пользователями). Такой подход позволяет изолировать ответственность компонентов и упрощает дальнейшее расширение функционала.</w:t>
       </w:r>
     </w:p>
     <w:p>
@@ -1254,7 +1278,7 @@
           <w:rFonts w:ascii="Times New Roman" w:hAnsi="Times New Roman"/>
           <w:sz w:val="28"/>
         </w:rPr>
-        <w:t>Надёжность программного продукта CodePath должна обеспечиваться за счёт предсказуемой обработки ошибок, строгой проверки входных данных и устойчивости к сбоям. На уровне серверной логики все запросы должны проходить валидацию: для операций, связанных с пользовательским контентом, требуется отсеивать пустые значения, проверять корректность связей между объектами (например, при ответах на квизы — соответствие идентификатора вопроса текущему уроку) и возвращать однозначные коды ошибок, чтобы интерфейс мог корректно реагировать на отказ, не приводя систему в неконсистентное состояние. Такая схема уже отражена в обработчиках, где предусмотрены проверки авторизации, существования сущностей и корректности данных с возвратом статусов 400/401/404 и защитной обработкой исключений.</w:t>
+        <w:t>Надёжность программного продукта CodePath должна обеспечиваться за счёт предсказуемой обработки ошибок, строгой проверки входных данных и устойчивости к сбоям. На уровне серверной логики все запросы должны проходить валидацию: для операций, связанных с пользовательским контентом, требуется отсеивать пустые значения, проверять корректность связей между объектами и возвращать однозначные коды ошибок, чтобы интерфейс мог корректно реагировать на отказ, не приводя систему в неконсистентное состояние.</w:t>
       </w:r>
     </w:p>
     <w:p>
@@ -1570,7 +1594,7 @@
           <w:rFonts w:ascii="Times New Roman" w:hAnsi="Times New Roman"/>
           <w:sz w:val="28"/>
         </w:rPr>
-        <w:t>В качестве СУБД выбрана PostgreSQL, а доступ к данным реализован через Drizzle ORM. Такой выбор позволяет хранить информацию в реляционном виде и при этом описывать структуру таблиц и связей в типизированном виде на стороне приложения, что удобно для сущностей «пользователь», «курс», «модуль», «урок», «квиз», «задача», «прогресс» и «достижение». Подключение к базе выполняется через строку DATABASE_URL с ограничением числа соединений и с учётом требований рабочего окружения.</w:t>
+        <w:t>В качестве СУБД выбрана PostgreSQL, а доступ к данным реализован через Drizzle ORM. Такой выбор позволяет хранить информацию в реляционном виде и при этом описывать структуру таблиц и связей в типизированном виде на стороне приложения, что удобно для сущностей «пользователь», «курс», «модуль», «урок», «квиз», «задача», «прогресс» и «достижение».</w:t>
       </w:r>
     </w:p>
     <w:p>
@@ -1597,7 +1621,7 @@
           <w:rFonts w:ascii="Times New Roman" w:hAnsi="Times New Roman"/>
           <w:sz w:val="28"/>
         </w:rPr>
-        <w:t>Информационная система веб-приложения «CodePath» построена по типовой схеме веб-сервиса и включает пользовательскую часть, серверную часть и слой данных. Пользовательская часть представляет собой набор страниц и компонентов интерфейса, которые отображаются в браузере и обеспечивают выполнение действий пользователя, а серверная часть обрабатывает запросы, выполняет проверки доступа, обращается к базе данных, выполняет пользовательский код и возвращает результаты в виде ответов для интерфейса. В проекте серверные обработчики реализованы как Express-маршруты (роутеры), работающие в Node.js-runtime, и используют JWT-аутентификацию для контроля доступа к операциям, изменяющим данные (запись на курс, отправка решения, отметка о прохождении урока и т.п.).</w:t>
+        <w:t>Информационная система веб-приложения «CodePath» построена по типовой схеме веб-сервиса и включает пользовательскую часть, серверную часть и слой данных. Пользовательская часть представляет собой набор страниц и компонентов интерфейса, которые отображаются в браузере и обеспечивают выполнение действий пользователя, а серверная часть обрабатывает запросы, выполняет проверки доступа, обращается к базе данных, выполняет пользовательский код и возвращает результаты в виде ответов для интерфейса.</w:t>
       </w:r>
     </w:p>
     <w:p>
@@ -1623,7 +1647,7 @@
           <w:rFonts w:ascii="Times New Roman" w:hAnsi="Times New Roman"/>
           <w:sz w:val="28"/>
         </w:rPr>
-        <w:t>Серверная часть логически разделена по функциональным направлениям, что выражается в отдельных Express-роутерах, объединяемых под общим префиксом API. В системе выделяются операции аутентификации (регистрация, вход, получение текущего пользователя), операции работы с курсами (каталог, детали курса, запись), операции прохождения уроков (получение содержимого, отправка ответов на квизы, отправка кода на проверку, отметка о завершении), операции геймификации (получение профиля, списка достижений, таблицы лидеров), а также административные операции (CRUD для всех сущностей контента). Такой подход делает структуру проекта более прозрачной и позволяет развивать функционал без изменения базового принципа работы системы.</w:t>
+        <w:t>Серверная часть логически разделена по функциональным направлениям, что выражается в отдельных Express-роутерах, объединяемых под общим префиксом API. В системе выделяются операции аутентификации, операции работы с курсами, операции прохождения уроков, операции геймификации, а также административные операции (CRUD для всех сущностей контента).</w:t>
       </w:r>
     </w:p>
     <w:p>
@@ -1636,7 +1660,7 @@
           <w:rFonts w:ascii="Times New Roman" w:hAnsi="Times New Roman"/>
           <w:sz w:val="28"/>
         </w:rPr>
-        <w:t>Отдельным элементом структуры является модуль выполнения пользовательского кода (CodeRunner). В проекте реализован серверный модуль, принимающий код пользователя и набор тест-кейсов, запускающий код через дочерние процессы (child_process) для Python и JavaScript, а также выполняющий проверку HTML, CSS и SQL через сопоставление с образцом. Результаты выполнения (вывод программы) сравниваются с ожидаемым результатом, и пользователю возвращается информация об успехе или ошибке каждого тест-кейса.</w:t>
+        <w:t>Отдельным элементом структуры является модуль выполнения пользовательского кода (CodeRunner). В проекте реализован серверный модуль, принимающий код пользователя и набор тест-кейсов, запускающий код через дочерние процессы для Python и JavaScript, а также выполняющий проверку HTML, CSS и SQL через сопоставление с образцом.</w:t>
       </w:r>
     </w:p>
     <w:p>
@@ -1966,12 +1990,12 @@
     </w:p>
     <w:p>
       <w:pPr>
-        <w:ind w:firstLine="709"/>
-        <w:jc w:val="both"/>
+        <w:jc w:val="center"/>
       </w:pPr>
       <w:r>
         <w:rPr>
           <w:rFonts w:ascii="Times New Roman" w:hAnsi="Times New Roman"/>
+          <w:b/>
           <w:sz w:val="28"/>
         </w:rPr>
         <w:t>Таблица 1. Исходные данные</w:t>
@@ -1985,14 +2009,14 @@
         <w:tblLook w:firstColumn="1" w:firstRow="1" w:lastColumn="0" w:lastRow="0" w:noHBand="0" w:noVBand="1" w:val="04A0"/>
       </w:tblPr>
       <w:tblGrid>
-        <w:gridCol w:w="3230"/>
-        <w:gridCol w:w="3230"/>
-        <w:gridCol w:w="3230"/>
+        <w:gridCol w:w="3118"/>
+        <w:gridCol w:w="3118"/>
+        <w:gridCol w:w="3118"/>
       </w:tblGrid>
       <w:tr>
         <w:tc>
           <w:tcPr>
-            <w:tcW w:type="dxa" w:w="3230"/>
+            <w:tcW w:type="dxa" w:w="3118"/>
           </w:tcPr>
           <w:p>
             <w:pPr>
@@ -2010,7 +2034,7 @@
         </w:tc>
         <w:tc>
           <w:tcPr>
-            <w:tcW w:type="dxa" w:w="3230"/>
+            <w:tcW w:type="dxa" w:w="3118"/>
           </w:tcPr>
           <w:p>
             <w:pPr>
@@ -2028,7 +2052,7 @@
         </w:tc>
         <w:tc>
           <w:tcPr>
-            <w:tcW w:type="dxa" w:w="3230"/>
+            <w:tcW w:type="dxa" w:w="3118"/>
           </w:tcPr>
           <w:p>
             <w:pPr>
@@ -2048,7 +2072,7 @@
       <w:tr>
         <w:tc>
           <w:tcPr>
-            <w:tcW w:type="dxa" w:w="3230"/>
+            <w:tcW w:type="dxa" w:w="3118"/>
           </w:tcPr>
           <w:p>
             <w:pPr>
@@ -2065,7 +2089,7 @@
         </w:tc>
         <w:tc>
           <w:tcPr>
-            <w:tcW w:type="dxa" w:w="3230"/>
+            <w:tcW w:type="dxa" w:w="3118"/>
           </w:tcPr>
           <w:p>
             <w:pPr>
@@ -2082,7 +2106,7 @@
         </w:tc>
         <w:tc>
           <w:tcPr>
-            <w:tcW w:type="dxa" w:w="3230"/>
+            <w:tcW w:type="dxa" w:w="3118"/>
           </w:tcPr>
           <w:p>
             <w:pPr>
@@ -2101,7 +2125,7 @@
       <w:tr>
         <w:tc>
           <w:tcPr>
-            <w:tcW w:type="dxa" w:w="3230"/>
+            <w:tcW w:type="dxa" w:w="3118"/>
           </w:tcPr>
           <w:p>
             <w:pPr>
@@ -2118,7 +2142,7 @@
         </w:tc>
         <w:tc>
           <w:tcPr>
-            <w:tcW w:type="dxa" w:w="3230"/>
+            <w:tcW w:type="dxa" w:w="3118"/>
           </w:tcPr>
           <w:p>
             <w:pPr>
@@ -2135,7 +2159,7 @@
         </w:tc>
         <w:tc>
           <w:tcPr>
-            <w:tcW w:type="dxa" w:w="3230"/>
+            <w:tcW w:type="dxa" w:w="3118"/>
           </w:tcPr>
           <w:p>
             <w:pPr>
@@ -2154,7 +2178,7 @@
       <w:tr>
         <w:tc>
           <w:tcPr>
-            <w:tcW w:type="dxa" w:w="3230"/>
+            <w:tcW w:type="dxa" w:w="3118"/>
           </w:tcPr>
           <w:p>
             <w:pPr>
@@ -2171,7 +2195,7 @@
         </w:tc>
         <w:tc>
           <w:tcPr>
-            <w:tcW w:type="dxa" w:w="3230"/>
+            <w:tcW w:type="dxa" w:w="3118"/>
           </w:tcPr>
           <w:p>
             <w:pPr>
@@ -2188,7 +2212,7 @@
         </w:tc>
         <w:tc>
           <w:tcPr>
-            <w:tcW w:type="dxa" w:w="3230"/>
+            <w:tcW w:type="dxa" w:w="3118"/>
           </w:tcPr>
           <w:p>
             <w:pPr>
@@ -2207,7 +2231,7 @@
       <w:tr>
         <w:tc>
           <w:tcPr>
-            <w:tcW w:type="dxa" w:w="3230"/>
+            <w:tcW w:type="dxa" w:w="3118"/>
           </w:tcPr>
           <w:p>
             <w:pPr>
@@ -2224,7 +2248,7 @@
         </w:tc>
         <w:tc>
           <w:tcPr>
-            <w:tcW w:type="dxa" w:w="3230"/>
+            <w:tcW w:type="dxa" w:w="3118"/>
           </w:tcPr>
           <w:p>
             <w:pPr>
@@ -2241,7 +2265,7 @@
         </w:tc>
         <w:tc>
           <w:tcPr>
-            <w:tcW w:type="dxa" w:w="3230"/>
+            <w:tcW w:type="dxa" w:w="3118"/>
           </w:tcPr>
           <w:p>
             <w:pPr>
@@ -2260,7 +2284,7 @@
       <w:tr>
         <w:tc>
           <w:tcPr>
-            <w:tcW w:type="dxa" w:w="3230"/>
+            <w:tcW w:type="dxa" w:w="3118"/>
           </w:tcPr>
           <w:p>
             <w:pPr>
@@ -2277,7 +2301,7 @@
         </w:tc>
         <w:tc>
           <w:tcPr>
-            <w:tcW w:type="dxa" w:w="3230"/>
+            <w:tcW w:type="dxa" w:w="3118"/>
           </w:tcPr>
           <w:p>
             <w:pPr>
@@ -2294,7 +2318,7 @@
         </w:tc>
         <w:tc>
           <w:tcPr>
-            <w:tcW w:type="dxa" w:w="3230"/>
+            <w:tcW w:type="dxa" w:w="3118"/>
           </w:tcPr>
           <w:p>
             <w:pPr>
@@ -2313,7 +2337,7 @@
       <w:tr>
         <w:tc>
           <w:tcPr>
-            <w:tcW w:type="dxa" w:w="3230"/>
+            <w:tcW w:type="dxa" w:w="3118"/>
           </w:tcPr>
           <w:p>
             <w:pPr>
@@ -2330,7 +2354,7 @@
         </w:tc>
         <w:tc>
           <w:tcPr>
-            <w:tcW w:type="dxa" w:w="3230"/>
+            <w:tcW w:type="dxa" w:w="3118"/>
           </w:tcPr>
           <w:p>
             <w:pPr>
@@ -2347,7 +2371,7 @@
         </w:tc>
         <w:tc>
           <w:tcPr>
-            <w:tcW w:type="dxa" w:w="3230"/>
+            <w:tcW w:type="dxa" w:w="3118"/>
           </w:tcPr>
           <w:p>
             <w:pPr>
@@ -2366,7 +2390,7 @@
       <w:tr>
         <w:tc>
           <w:tcPr>
-            <w:tcW w:type="dxa" w:w="3230"/>
+            <w:tcW w:type="dxa" w:w="3118"/>
           </w:tcPr>
           <w:p>
             <w:pPr>
@@ -2383,7 +2407,7 @@
         </w:tc>
         <w:tc>
           <w:tcPr>
-            <w:tcW w:type="dxa" w:w="3230"/>
+            <w:tcW w:type="dxa" w:w="3118"/>
           </w:tcPr>
           <w:p>
             <w:pPr>
@@ -2400,7 +2424,7 @@
         </w:tc>
         <w:tc>
           <w:tcPr>
-            <w:tcW w:type="dxa" w:w="3230"/>
+            <w:tcW w:type="dxa" w:w="3118"/>
           </w:tcPr>
           <w:p>
             <w:pPr>
@@ -2419,7 +2443,7 @@
       <w:tr>
         <w:tc>
           <w:tcPr>
-            <w:tcW w:type="dxa" w:w="3230"/>
+            <w:tcW w:type="dxa" w:w="3118"/>
           </w:tcPr>
           <w:p>
             <w:pPr>
@@ -2436,7 +2460,7 @@
         </w:tc>
         <w:tc>
           <w:tcPr>
-            <w:tcW w:type="dxa" w:w="3230"/>
+            <w:tcW w:type="dxa" w:w="3118"/>
           </w:tcPr>
           <w:p>
             <w:pPr>
@@ -2453,7 +2477,7 @@
         </w:tc>
         <w:tc>
           <w:tcPr>
-            <w:tcW w:type="dxa" w:w="3230"/>
+            <w:tcW w:type="dxa" w:w="3118"/>
           </w:tcPr>
           <w:p>
             <w:pPr>
@@ -2472,7 +2496,7 @@
       <w:tr>
         <w:tc>
           <w:tcPr>
-            <w:tcW w:type="dxa" w:w="3230"/>
+            <w:tcW w:type="dxa" w:w="3118"/>
           </w:tcPr>
           <w:p>
             <w:pPr>
@@ -2489,7 +2513,7 @@
         </w:tc>
         <w:tc>
           <w:tcPr>
-            <w:tcW w:type="dxa" w:w="3230"/>
+            <w:tcW w:type="dxa" w:w="3118"/>
           </w:tcPr>
           <w:p>
             <w:pPr>
@@ -2506,7 +2530,7 @@
         </w:tc>
         <w:tc>
           <w:tcPr>
-            <w:tcW w:type="dxa" w:w="3230"/>
+            <w:tcW w:type="dxa" w:w="3118"/>
           </w:tcPr>
           <w:p>
             <w:pPr>
@@ -2525,7 +2549,7 @@
       <w:tr>
         <w:tc>
           <w:tcPr>
-            <w:tcW w:type="dxa" w:w="3230"/>
+            <w:tcW w:type="dxa" w:w="3118"/>
           </w:tcPr>
           <w:p>
             <w:pPr>
@@ -2542,7 +2566,7 @@
         </w:tc>
         <w:tc>
           <w:tcPr>
-            <w:tcW w:type="dxa" w:w="3230"/>
+            <w:tcW w:type="dxa" w:w="3118"/>
           </w:tcPr>
           <w:p>
             <w:pPr>
@@ -2559,7 +2583,7 @@
         </w:tc>
         <w:tc>
           <w:tcPr>
-            <w:tcW w:type="dxa" w:w="3230"/>
+            <w:tcW w:type="dxa" w:w="3118"/>
           </w:tcPr>
           <w:p>
             <w:pPr>
@@ -2578,7 +2602,7 @@
       <w:tr>
         <w:tc>
           <w:tcPr>
-            <w:tcW w:type="dxa" w:w="3230"/>
+            <w:tcW w:type="dxa" w:w="3118"/>
           </w:tcPr>
           <w:p>
             <w:pPr>
@@ -2595,7 +2619,7 @@
         </w:tc>
         <w:tc>
           <w:tcPr>
-            <w:tcW w:type="dxa" w:w="3230"/>
+            <w:tcW w:type="dxa" w:w="3118"/>
           </w:tcPr>
           <w:p>
             <w:pPr>
@@ -2612,7 +2636,7 @@
         </w:tc>
         <w:tc>
           <w:tcPr>
-            <w:tcW w:type="dxa" w:w="3230"/>
+            <w:tcW w:type="dxa" w:w="3118"/>
           </w:tcPr>
           <w:p>
             <w:pPr>
@@ -2631,7 +2655,7 @@
       <w:tr>
         <w:tc>
           <w:tcPr>
-            <w:tcW w:type="dxa" w:w="3230"/>
+            <w:tcW w:type="dxa" w:w="3118"/>
           </w:tcPr>
           <w:p>
             <w:pPr>
@@ -2648,7 +2672,7 @@
         </w:tc>
         <w:tc>
           <w:tcPr>
-            <w:tcW w:type="dxa" w:w="3230"/>
+            <w:tcW w:type="dxa" w:w="3118"/>
           </w:tcPr>
           <w:p>
             <w:pPr>
@@ -2665,7 +2689,7 @@
         </w:tc>
         <w:tc>
           <w:tcPr>
-            <w:tcW w:type="dxa" w:w="3230"/>
+            <w:tcW w:type="dxa" w:w="3118"/>
           </w:tcPr>
           <w:p>
             <w:pPr>
@@ -2684,7 +2708,7 @@
       <w:tr>
         <w:tc>
           <w:tcPr>
-            <w:tcW w:type="dxa" w:w="3230"/>
+            <w:tcW w:type="dxa" w:w="3118"/>
           </w:tcPr>
           <w:p>
             <w:pPr>
@@ -2701,7 +2725,7 @@
         </w:tc>
         <w:tc>
           <w:tcPr>
-            <w:tcW w:type="dxa" w:w="3230"/>
+            <w:tcW w:type="dxa" w:w="3118"/>
           </w:tcPr>
           <w:p>
             <w:pPr>
@@ -2718,7 +2742,7 @@
         </w:tc>
         <w:tc>
           <w:tcPr>
-            <w:tcW w:type="dxa" w:w="3230"/>
+            <w:tcW w:type="dxa" w:w="3118"/>
           </w:tcPr>
           <w:p>
             <w:pPr>
@@ -2737,7 +2761,7 @@
       <w:tr>
         <w:tc>
           <w:tcPr>
-            <w:tcW w:type="dxa" w:w="3230"/>
+            <w:tcW w:type="dxa" w:w="3118"/>
           </w:tcPr>
           <w:p>
             <w:pPr>
@@ -2754,7 +2778,7 @@
         </w:tc>
         <w:tc>
           <w:tcPr>
-            <w:tcW w:type="dxa" w:w="3230"/>
+            <w:tcW w:type="dxa" w:w="3118"/>
           </w:tcPr>
           <w:p>
             <w:pPr>
@@ -2771,7 +2795,7 @@
         </w:tc>
         <w:tc>
           <w:tcPr>
-            <w:tcW w:type="dxa" w:w="3230"/>
+            <w:tcW w:type="dxa" w:w="3118"/>
           </w:tcPr>
           <w:p>
             <w:pPr>
@@ -2790,7 +2814,7 @@
       <w:tr>
         <w:tc>
           <w:tcPr>
-            <w:tcW w:type="dxa" w:w="3230"/>
+            <w:tcW w:type="dxa" w:w="3118"/>
           </w:tcPr>
           <w:p>
             <w:pPr>
@@ -2807,7 +2831,7 @@
         </w:tc>
         <w:tc>
           <w:tcPr>
-            <w:tcW w:type="dxa" w:w="3230"/>
+            <w:tcW w:type="dxa" w:w="3118"/>
           </w:tcPr>
           <w:p>
             <w:pPr>
@@ -2824,7 +2848,7 @@
         </w:tc>
         <w:tc>
           <w:tcPr>
-            <w:tcW w:type="dxa" w:w="3230"/>
+            <w:tcW w:type="dxa" w:w="3118"/>
           </w:tcPr>
           <w:p>
             <w:pPr>
@@ -2843,7 +2867,7 @@
       <w:tr>
         <w:tc>
           <w:tcPr>
-            <w:tcW w:type="dxa" w:w="3230"/>
+            <w:tcW w:type="dxa" w:w="3118"/>
           </w:tcPr>
           <w:p>
             <w:pPr>
@@ -2860,7 +2884,7 @@
         </w:tc>
         <w:tc>
           <w:tcPr>
-            <w:tcW w:type="dxa" w:w="3230"/>
+            <w:tcW w:type="dxa" w:w="3118"/>
           </w:tcPr>
           <w:p>
             <w:pPr>
@@ -2877,7 +2901,7 @@
         </w:tc>
         <w:tc>
           <w:tcPr>
-            <w:tcW w:type="dxa" w:w="3230"/>
+            <w:tcW w:type="dxa" w:w="3118"/>
           </w:tcPr>
           <w:p>
             <w:pPr>
@@ -2896,7 +2920,7 @@
       <w:tr>
         <w:tc>
           <w:tcPr>
-            <w:tcW w:type="dxa" w:w="3230"/>
+            <w:tcW w:type="dxa" w:w="3118"/>
           </w:tcPr>
           <w:p>
             <w:pPr>
@@ -2913,7 +2937,7 @@
         </w:tc>
         <w:tc>
           <w:tcPr>
-            <w:tcW w:type="dxa" w:w="3230"/>
+            <w:tcW w:type="dxa" w:w="3118"/>
           </w:tcPr>
           <w:p>
             <w:pPr>
@@ -2930,7 +2954,7 @@
         </w:tc>
         <w:tc>
           <w:tcPr>
-            <w:tcW w:type="dxa" w:w="3230"/>
+            <w:tcW w:type="dxa" w:w="3118"/>
           </w:tcPr>
           <w:p>
             <w:pPr>
@@ -2949,7 +2973,7 @@
       <w:tr>
         <w:tc>
           <w:tcPr>
-            <w:tcW w:type="dxa" w:w="3230"/>
+            <w:tcW w:type="dxa" w:w="3118"/>
           </w:tcPr>
           <w:p>
             <w:pPr>
@@ -2966,7 +2990,7 @@
         </w:tc>
         <w:tc>
           <w:tcPr>
-            <w:tcW w:type="dxa" w:w="3230"/>
+            <w:tcW w:type="dxa" w:w="3118"/>
           </w:tcPr>
           <w:p>
             <w:pPr>
@@ -2983,7 +3007,7 @@
         </w:tc>
         <w:tc>
           <w:tcPr>
-            <w:tcW w:type="dxa" w:w="3230"/>
+            <w:tcW w:type="dxa" w:w="3118"/>
           </w:tcPr>
           <w:p>
             <w:pPr>
@@ -3002,7 +3026,7 @@
       <w:tr>
         <w:tc>
           <w:tcPr>
-            <w:tcW w:type="dxa" w:w="3230"/>
+            <w:tcW w:type="dxa" w:w="3118"/>
           </w:tcPr>
           <w:p>
             <w:pPr>
@@ -3013,13 +3037,13 @@
                 <w:rFonts w:ascii="Times New Roman" w:hAnsi="Times New Roman"/>
                 <w:sz w:val="24"/>
               </w:rPr>
-              <w:t>Рекламные расходы (регистрация сайта в каталогах, покупка баннеров на других ресурсах, добавление статей в каталоги статей)</w:t>
+              <w:t>Рекламные расходы</w:t>
             </w:r>
           </w:p>
         </w:tc>
         <w:tc>
           <w:tcPr>
-            <w:tcW w:type="dxa" w:w="3230"/>
+            <w:tcW w:type="dxa" w:w="3118"/>
           </w:tcPr>
           <w:p>
             <w:pPr>
@@ -3036,7 +3060,7 @@
         </w:tc>
         <w:tc>
           <w:tcPr>
-            <w:tcW w:type="dxa" w:w="3230"/>
+            <w:tcW w:type="dxa" w:w="3118"/>
           </w:tcPr>
           <w:p>
             <w:pPr>
@@ -3188,7 +3212,7 @@
           <w:rFonts w:ascii="Times New Roman" w:hAnsi="Times New Roman"/>
           <w:sz w:val="28"/>
         </w:rPr>
-        <w:t>Определение затрат на оплату труда (в случае привлечения разных специалистов определяется отдельно по каждому) производится по формуле (2):</w:t>
+        <w:t>Определение затрат на оплату труда производится по формуле (2):</w:t>
       </w:r>
     </w:p>
     <w:p>
@@ -3357,7 +3381,7 @@
           <w:rFonts w:ascii="Times New Roman" w:hAnsi="Times New Roman"/>
           <w:sz w:val="28"/>
         </w:rPr>
-        <w:t>Амортизационные отчисления - отчисления части стоимости основных фондов для возмещения их износа. Амортизационные отчисления включаются в издержки производства на основе установленных норм и балансовой стоимости основных фондов и рассчитываются по формуле (4):</w:t>
+        <w:t>Амортизационные отчисления – отчисления части стоимости основных фондов для возмещения их износа. Амортизационные отчисления включаются в издержки производства и рассчитываются по формуле (4):</w:t>
       </w:r>
     </w:p>
     <w:p>
@@ -3551,7 +3575,7 @@
           <w:rFonts w:ascii="Times New Roman" w:hAnsi="Times New Roman"/>
           <w:sz w:val="28"/>
         </w:rPr>
-        <w:t>Затраты на материалы, необходимые для эксплуатации компьютера рассчитывается по формуле (7):</w:t>
+        <w:t>Затраты на материалы рассчитывается по формуле (7):</w:t>
       </w:r>
     </w:p>
     <w:p>
@@ -3659,15 +3683,15 @@
     </w:p>
     <w:p>
       <w:pPr>
-        <w:ind w:firstLine="709"/>
-        <w:jc w:val="both"/>
+        <w:jc w:val="center"/>
       </w:pPr>
       <w:r>
         <w:rPr>
           <w:rFonts w:ascii="Times New Roman" w:hAnsi="Times New Roman"/>
+          <w:b/>
           <w:sz w:val="28"/>
         </w:rPr>
-        <w:t>Таблица 2 - Расчет себестоимости программного продукта</w:t>
+        <w:t>Таблица 2 – Расчет себестоимости программного продукта</w:t>
       </w:r>
     </w:p>
     <w:tbl>
@@ -3678,13 +3702,13 @@
         <w:tblLook w:firstColumn="1" w:firstRow="1" w:lastColumn="0" w:lastRow="0" w:noHBand="0" w:noVBand="1" w:val="04A0"/>
       </w:tblPr>
       <w:tblGrid>
-        <w:gridCol w:w="4844"/>
-        <w:gridCol w:w="4844"/>
+        <w:gridCol w:w="4677"/>
+        <w:gridCol w:w="4677"/>
       </w:tblGrid>
       <w:tr>
         <w:tc>
           <w:tcPr>
-            <w:tcW w:type="dxa" w:w="4844"/>
+            <w:tcW w:type="dxa" w:w="4677"/>
           </w:tcPr>
           <w:p>
             <w:pPr>
@@ -3702,7 +3726,7 @@
         </w:tc>
         <w:tc>
           <w:tcPr>
-            <w:tcW w:type="dxa" w:w="4844"/>
+            <w:tcW w:type="dxa" w:w="4677"/>
           </w:tcPr>
           <w:p>
             <w:pPr>
@@ -3722,7 +3746,7 @@
       <w:tr>
         <w:tc>
           <w:tcPr>
-            <w:tcW w:type="dxa" w:w="4844"/>
+            <w:tcW w:type="dxa" w:w="4677"/>
           </w:tcPr>
           <w:p>
             <w:pPr>
@@ -3739,7 +3763,7 @@
         </w:tc>
         <w:tc>
           <w:tcPr>
-            <w:tcW w:type="dxa" w:w="4844"/>
+            <w:tcW w:type="dxa" w:w="4677"/>
           </w:tcPr>
           <w:p>
             <w:pPr>
@@ -3758,7 +3782,7 @@
       <w:tr>
         <w:tc>
           <w:tcPr>
-            <w:tcW w:type="dxa" w:w="4844"/>
+            <w:tcW w:type="dxa" w:w="4677"/>
           </w:tcPr>
           <w:p>
             <w:pPr>
@@ -3775,7 +3799,7 @@
         </w:tc>
         <w:tc>
           <w:tcPr>
-            <w:tcW w:type="dxa" w:w="4844"/>
+            <w:tcW w:type="dxa" w:w="4677"/>
           </w:tcPr>
           <w:p>
             <w:pPr>
@@ -3794,7 +3818,7 @@
       <w:tr>
         <w:tc>
           <w:tcPr>
-            <w:tcW w:type="dxa" w:w="4844"/>
+            <w:tcW w:type="dxa" w:w="4677"/>
           </w:tcPr>
           <w:p>
             <w:pPr>
@@ -3811,7 +3835,7 @@
         </w:tc>
         <w:tc>
           <w:tcPr>
-            <w:tcW w:type="dxa" w:w="4844"/>
+            <w:tcW w:type="dxa" w:w="4677"/>
           </w:tcPr>
           <w:p>
             <w:pPr>
@@ -3830,7 +3854,7 @@
       <w:tr>
         <w:tc>
           <w:tcPr>
-            <w:tcW w:type="dxa" w:w="4844"/>
+            <w:tcW w:type="dxa" w:w="4677"/>
           </w:tcPr>
           <w:p>
             <w:pPr>
@@ -3847,7 +3871,7 @@
         </w:tc>
         <w:tc>
           <w:tcPr>
-            <w:tcW w:type="dxa" w:w="4844"/>
+            <w:tcW w:type="dxa" w:w="4677"/>
           </w:tcPr>
           <w:p>
             <w:pPr>
@@ -3866,7 +3890,7 @@
       <w:tr>
         <w:tc>
           <w:tcPr>
-            <w:tcW w:type="dxa" w:w="4844"/>
+            <w:tcW w:type="dxa" w:w="4677"/>
           </w:tcPr>
           <w:p>
             <w:pPr>
@@ -3883,7 +3907,7 @@
         </w:tc>
         <w:tc>
           <w:tcPr>
-            <w:tcW w:type="dxa" w:w="4844"/>
+            <w:tcW w:type="dxa" w:w="4677"/>
           </w:tcPr>
           <w:p>
             <w:pPr>
@@ -3902,7 +3926,7 @@
       <w:tr>
         <w:tc>
           <w:tcPr>
-            <w:tcW w:type="dxa" w:w="4844"/>
+            <w:tcW w:type="dxa" w:w="4677"/>
           </w:tcPr>
           <w:p>
             <w:pPr>
@@ -3919,7 +3943,7 @@
         </w:tc>
         <w:tc>
           <w:tcPr>
-            <w:tcW w:type="dxa" w:w="4844"/>
+            <w:tcW w:type="dxa" w:w="4677"/>
           </w:tcPr>
           <w:p>
             <w:pPr>
@@ -3938,7 +3962,7 @@
       <w:tr>
         <w:tc>
           <w:tcPr>
-            <w:tcW w:type="dxa" w:w="4844"/>
+            <w:tcW w:type="dxa" w:w="4677"/>
           </w:tcPr>
           <w:p>
             <w:pPr>
@@ -3955,7 +3979,7 @@
         </w:tc>
         <w:tc>
           <w:tcPr>
-            <w:tcW w:type="dxa" w:w="4844"/>
+            <w:tcW w:type="dxa" w:w="4677"/>
           </w:tcPr>
           <w:p>
             <w:pPr>
@@ -3974,7 +3998,7 @@
       <w:tr>
         <w:tc>
           <w:tcPr>
-            <w:tcW w:type="dxa" w:w="4844"/>
+            <w:tcW w:type="dxa" w:w="4677"/>
           </w:tcPr>
           <w:p>
             <w:pPr>
@@ -3991,7 +4015,7 @@
         </w:tc>
         <w:tc>
           <w:tcPr>
-            <w:tcW w:type="dxa" w:w="4844"/>
+            <w:tcW w:type="dxa" w:w="4677"/>
           </w:tcPr>
           <w:p>
             <w:pPr>
@@ -4010,7 +4034,7 @@
       <w:tr>
         <w:tc>
           <w:tcPr>
-            <w:tcW w:type="dxa" w:w="4844"/>
+            <w:tcW w:type="dxa" w:w="4677"/>
           </w:tcPr>
           <w:p>
             <w:pPr>
@@ -4027,7 +4051,7 @@
         </w:tc>
         <w:tc>
           <w:tcPr>
-            <w:tcW w:type="dxa" w:w="4844"/>
+            <w:tcW w:type="dxa" w:w="4677"/>
           </w:tcPr>
           <w:p>
             <w:pPr>
@@ -4046,7 +4070,7 @@
       <w:tr>
         <w:tc>
           <w:tcPr>
-            <w:tcW w:type="dxa" w:w="4844"/>
+            <w:tcW w:type="dxa" w:w="4677"/>
           </w:tcPr>
           <w:p>
             <w:pPr>
@@ -4063,7 +4087,7 @@
         </w:tc>
         <w:tc>
           <w:tcPr>
-            <w:tcW w:type="dxa" w:w="4844"/>
+            <w:tcW w:type="dxa" w:w="4677"/>
           </w:tcPr>
           <w:p>
             <w:pPr>
@@ -4082,7 +4106,7 @@
       <w:tr>
         <w:tc>
           <w:tcPr>
-            <w:tcW w:type="dxa" w:w="4844"/>
+            <w:tcW w:type="dxa" w:w="4677"/>
           </w:tcPr>
           <w:p>
             <w:pPr>
@@ -4100,7 +4124,7 @@
         </w:tc>
         <w:tc>
           <w:tcPr>
-            <w:tcW w:type="dxa" w:w="4844"/>
+            <w:tcW w:type="dxa" w:w="4677"/>
           </w:tcPr>
           <w:p>
             <w:pPr>
@@ -4355,7 +4379,7 @@
           <w:rFonts w:ascii="Times New Roman" w:hAnsi="Times New Roman"/>
           <w:sz w:val="28"/>
         </w:rPr>
-        <w:t>Зитог - общая сумма денежных средств, потраченных на его разработку, внедрение и адаптацию (включая лицензирование, обслуживание, поддержку) составляет ххх.</w:t>
+        <w:t>Зитог - общая сумма денежных средств, потраченных на его разработку, внедрение и адаптацию составляет ххх.</w:t>
       </w:r>
     </w:p>
     <w:p>
@@ -4616,13 +4640,195 @@
       </w:r>
     </w:p>
     <w:sectPr>
-      <w:pgSz w:w="12240" w:h="15840"/>
-      <w:pgMar w:top="1134" w:right="850" w:bottom="1134" w:left="1701" w:header="720" w:footer="720" w:gutter="0"/>
+      <w:footerReference w:type="default" r:id="rId9"/>
+      <w:pgSz w:w="11906" w:h="16838"/>
+      <w:pgMar w:top="850" w:right="850" w:bottom="1417" w:left="1701" w:header="720" w:footer="720" w:gutter="0"/>
       <w:cols w:space="720"/>
       <w:docGrid w:linePitch="360"/>
+      <w:pgBorders w:offsetFrom="page">
+        <w:top w:val="single" w:sz="6" w:space="25" w:color="000000"/>
+        <w:left w:val="single" w:sz="12" w:space="55" w:color="000000"/>
+        <w:bottom w:val="single" w:sz="6" w:space="25" w:color="000000"/>
+        <w:right w:val="single" w:sz="6" w:space="25" w:color="000000"/>
+      </w:pgBorders>
     </w:sectPr>
   </w:body>
 </w:document>
+</file>
+
+<file path=word/footer1.xml><?xml version="1.0" encoding="utf-8"?>
+<w:ftr xmlns:m="http://schemas.openxmlformats.org/officeDocument/2006/math" xmlns:mc="http://schemas.openxmlformats.org/markup-compatibility/2006" xmlns:mo="http://schemas.microsoft.com/office/mac/office/2008/main" xmlns:mv="urn:schemas-microsoft-com:mac:vml" xmlns:o="urn:schemas-microsoft-com:office:office" xmlns:r="http://schemas.openxmlformats.org/officeDocument/2006/relationships" xmlns:v="urn:schemas-microsoft-com:vml" xmlns:w10="urn:schemas-microsoft-com:office:word" xmlns:w14="http://schemas.microsoft.com/office/word/2010/wordml" xmlns:w="http://schemas.openxmlformats.org/wordprocessingml/2006/main" xmlns:wne="http://schemas.microsoft.com/office/word/2006/wordml" xmlns:wp14="http://schemas.microsoft.com/office/word/2010/wordprocessingDrawing" xmlns:wp="http://schemas.openxmlformats.org/drawingml/2006/wordprocessingDrawing" xmlns:wpc="http://schemas.microsoft.com/office/word/2010/wordprocessingCanvas" xmlns:wpg="http://schemas.microsoft.com/office/word/2010/wordprocessingGroup" xmlns:wpi="http://schemas.microsoft.com/office/word/2010/wordprocessingInk" xmlns:wps="http://schemas.microsoft.com/office/word/2010/wordprocessingShape" mc:Ignorable="w14 wp14">
+  <w:p>
+    <w:pPr>
+      <w:pStyle w:val="Footer"/>
+    </w:pPr>
+  </w:p>
+  <w:tbl>
+    <w:tblPr>
+      <w:tblW w:type="auto" w:w="0"/>
+      <w:jc w:val="center"/>
+      <w:tblLook w:firstColumn="1" w:firstRow="1" w:lastColumn="0" w:lastRow="0" w:noHBand="0" w:noVBand="1" w:val="04A0"/>
+      <w:tblBorders>
+        <w:top w:val="single" w:sz="4" w:space="0" w:color="000000"/>
+        <w:left w:val="single" w:sz="4" w:space="0" w:color="000000"/>
+        <w:bottom w:val="single" w:sz="4" w:space="0" w:color="000000"/>
+        <w:right w:val="single" w:sz="4" w:space="0" w:color="000000"/>
+        <w:insideH w:val="single" w:sz="4" w:space="0" w:color="000000"/>
+        <w:insideV w:val="single" w:sz="4" w:space="0" w:color="000000"/>
+      </w:tblBorders>
+    </w:tblPr>
+    <w:tblGrid>
+      <w:gridCol w:w="1559"/>
+      <w:gridCol w:w="1559"/>
+      <w:gridCol w:w="1559"/>
+      <w:gridCol w:w="1559"/>
+      <w:gridCol w:w="1559"/>
+      <w:gridCol w:w="1559"/>
+    </w:tblGrid>
+    <w:tr>
+      <w:tc>
+        <w:tcPr>
+          <w:tcW w:type="dxa" w:w="680"/>
+          <w:vAlign w:val="center"/>
+        </w:tcPr>
+        <w:p>
+          <w:pPr>
+            <w:jc w:val="center"/>
+          </w:pPr>
+          <w:r>
+            <w:rPr>
+              <w:rFonts w:ascii="Times New Roman" w:hAnsi="Times New Roman"/>
+              <w:sz w:val="16"/>
+            </w:rPr>
+            <w:t>Изм.</w:t>
+          </w:r>
+        </w:p>
+      </w:tc>
+      <w:tc>
+        <w:tcPr>
+          <w:tcW w:type="dxa" w:w="850"/>
+          <w:vAlign w:val="center"/>
+        </w:tcPr>
+        <w:p>
+          <w:pPr>
+            <w:jc w:val="center"/>
+          </w:pPr>
+          <w:r>
+            <w:rPr>
+              <w:rFonts w:ascii="Times New Roman" w:hAnsi="Times New Roman"/>
+              <w:sz w:val="16"/>
+            </w:rPr>
+            <w:t>Лист</w:t>
+          </w:r>
+        </w:p>
+      </w:tc>
+      <w:tc>
+        <w:tcPr>
+          <w:tcW w:type="dxa" w:w="1134"/>
+          <w:vAlign w:val="center"/>
+        </w:tcPr>
+        <w:p>
+          <w:pPr>
+            <w:jc w:val="center"/>
+          </w:pPr>
+          <w:r>
+            <w:rPr>
+              <w:rFonts w:ascii="Times New Roman" w:hAnsi="Times New Roman"/>
+              <w:sz w:val="16"/>
+            </w:rPr>
+            <w:t>№ докум.</w:t>
+          </w:r>
+        </w:p>
+      </w:tc>
+      <w:tc>
+        <w:tcPr>
+          <w:tcW w:type="dxa" w:w="850"/>
+          <w:vAlign w:val="center"/>
+        </w:tcPr>
+        <w:p>
+          <w:pPr>
+            <w:jc w:val="center"/>
+          </w:pPr>
+          <w:r>
+            <w:rPr>
+              <w:rFonts w:ascii="Times New Roman" w:hAnsi="Times New Roman"/>
+              <w:sz w:val="16"/>
+            </w:rPr>
+            <w:t>Подпись</w:t>
+          </w:r>
+        </w:p>
+      </w:tc>
+      <w:tc>
+        <w:tcPr>
+          <w:tcW w:type="dxa" w:w="850"/>
+          <w:vAlign w:val="center"/>
+        </w:tcPr>
+        <w:p>
+          <w:pPr>
+            <w:jc w:val="center"/>
+          </w:pPr>
+          <w:r>
+            <w:rPr>
+              <w:rFonts w:ascii="Times New Roman" w:hAnsi="Times New Roman"/>
+              <w:sz w:val="16"/>
+            </w:rPr>
+            <w:t>Дата</w:t>
+          </w:r>
+        </w:p>
+      </w:tc>
+      <w:tc>
+        <w:tcPr>
+          <w:tcW w:type="dxa" w:w="4989"/>
+          <w:vAlign w:val="center"/>
+        </w:tcPr>
+        <w:p>
+          <w:pPr>
+            <w:jc w:val="center"/>
+          </w:pPr>
+          <w:r>
+            <w:rPr>
+              <w:rFonts w:ascii="Times New Roman" w:hAnsi="Times New Roman"/>
+              <w:sz w:val="16"/>
+            </w:rPr>
+            <w:t>ВТ-416-01-25-ПЗ</w:t>
+          </w:r>
+        </w:p>
+      </w:tc>
+    </w:tr>
+    <w:tr>
+      <w:tc>
+        <w:tcPr>
+          <w:tcW w:type="dxa" w:w="4364"/>
+          <w:gridSpan w:val="5"/>
+          <w:vAlign w:val="center"/>
+        </w:tcPr>
+        <w:p>
+          <w:pPr>
+            <w:jc w:val="center"/>
+          </w:pPr>
+        </w:p>
+      </w:tc>
+      <w:tc>
+        <w:tcPr>
+          <w:tcW w:type="dxa" w:w="4989"/>
+          <w:vAlign w:val="center"/>
+        </w:tcPr>
+        <w:p>
+          <w:pPr>
+            <w:jc w:val="center"/>
+          </w:pPr>
+          <w:r>
+            <w:rPr>
+              <w:rFonts w:ascii="Times New Roman" w:hAnsi="Times New Roman"/>
+              <w:sz w:val="16"/>
+            </w:rPr>
+            <w:t>Лист</w:t>
+          </w:r>
+        </w:p>
+      </w:tc>
+    </w:tr>
+  </w:tbl>
+</w:ftr>
 </file>
 
 <file path=word/numbering.xml><?xml version="1.0" encoding="utf-8"?>
@@ -4992,6 +5198,7 @@
       <w:spacing w:line="360" w:lineRule="auto" w:after="0" w:before="0"/>
     </w:pPr>
     <w:rPr>
+      <w:rFonts w:eastAsia="Times New Roman"/>
       <w:rFonts w:ascii="Times New Roman" w:hAnsi="Times New Roman"/>
       <w:sz w:val="28"/>
     </w:rPr>

</xml_diff>

<commit_message>
Add GOST stamp, page borders, and clickable links to document
Update document to include GOST-style title blocks and page borders, and implement hyperlinks within the table of contents for improved navigation.

Replit-Commit-Author: Agent
Replit-Commit-Session-Id: d1abefa3-a3f4-4e72-a882-36602e48f1c1
Replit-Commit-Checkpoint-Type: full_checkpoint
Replit-Commit-Event-Id: 4bc3daea-9bef-407b-b8f2-655da2da39c8
Replit-Commit-Screenshot-Url: https://storage.googleapis.com/screenshot-production-us-central1/eab40536-890d-4edc-a000-c767b2eebd09/d1abefa3-a3f4-4e72-a882-36602e48f1c1/W8e3DTc
Replit-Helium-Checkpoint-Created: true
</commit_message>
<xml_diff>
--- a/CodePath_Пояснительная_записка.docx
+++ b/CodePath_Пояснительная_записка.docx
@@ -3,6 +3,496 @@
 <w:document xmlns:wpc="http://schemas.microsoft.com/office/word/2010/wordprocessingCanvas" xmlns:mo="http://schemas.microsoft.com/office/mac/office/2008/main" xmlns:mc="http://schemas.openxmlformats.org/markup-compatibility/2006" xmlns:mv="urn:schemas-microsoft-com:mac:vml" xmlns:o="urn:schemas-microsoft-com:office:office" xmlns:r="http://schemas.openxmlformats.org/officeDocument/2006/relationships" xmlns:m="http://schemas.openxmlformats.org/officeDocument/2006/math" xmlns:v="urn:schemas-microsoft-com:vml" xmlns:wp14="http://schemas.microsoft.com/office/word/2010/wordprocessingDrawing" xmlns:wp="http://schemas.openxmlformats.org/drawingml/2006/wordprocessingDrawing" xmlns:w10="urn:schemas-microsoft-com:office:word" xmlns:w="http://schemas.openxmlformats.org/wordprocessingml/2006/main" xmlns:w14="http://schemas.microsoft.com/office/word/2010/wordml" xmlns:wpg="http://schemas.microsoft.com/office/word/2010/wordprocessingGroup" xmlns:wpi="http://schemas.microsoft.com/office/word/2010/wordprocessingInk" xmlns:wne="http://schemas.microsoft.com/office/word/2006/wordml" xmlns:wps="http://schemas.microsoft.com/office/word/2010/wordprocessingShape" mc:Ignorable="w14 wp14">
   <w:body>
     <w:p>
+      <w:r>
+        <w:rPr>
+          <w:rFonts w:ascii="Times New Roman" w:hAnsi="Times New Roman"/>
+          <w:sz w:val="28"/>
+        </w:rPr>
+      </w:r>
+    </w:p>
+    <w:p>
+      <w:r>
+        <w:rPr>
+          <w:rFonts w:ascii="Times New Roman" w:hAnsi="Times New Roman"/>
+          <w:sz w:val="28"/>
+        </w:rPr>
+      </w:r>
+    </w:p>
+    <w:p>
+      <w:r>
+        <w:rPr>
+          <w:rFonts w:ascii="Times New Roman" w:hAnsi="Times New Roman"/>
+          <w:sz w:val="28"/>
+        </w:rPr>
+      </w:r>
+    </w:p>
+    <w:p>
+      <w:r>
+        <w:rPr>
+          <w:rFonts w:ascii="Times New Roman" w:hAnsi="Times New Roman"/>
+          <w:sz w:val="28"/>
+        </w:rPr>
+      </w:r>
+    </w:p>
+    <w:p>
+      <w:r>
+        <w:rPr>
+          <w:rFonts w:ascii="Times New Roman" w:hAnsi="Times New Roman"/>
+          <w:sz w:val="28"/>
+        </w:rPr>
+      </w:r>
+    </w:p>
+    <w:p>
+      <w:r>
+        <w:rPr>
+          <w:rFonts w:ascii="Times New Roman" w:hAnsi="Times New Roman"/>
+          <w:sz w:val="28"/>
+        </w:rPr>
+      </w:r>
+    </w:p>
+    <w:p>
+      <w:r>
+        <w:rPr>
+          <w:rFonts w:ascii="Times New Roman" w:hAnsi="Times New Roman"/>
+          <w:sz w:val="28"/>
+        </w:rPr>
+      </w:r>
+    </w:p>
+    <w:p>
+      <w:r>
+        <w:rPr>
+          <w:rFonts w:ascii="Times New Roman" w:hAnsi="Times New Roman"/>
+          <w:sz w:val="28"/>
+        </w:rPr>
+      </w:r>
+    </w:p>
+    <w:tbl>
+      <w:tblPr>
+        <w:tblStyle w:val="TableGrid"/>
+        <w:tblW w:type="auto" w:w="0"/>
+        <w:jc w:val="center"/>
+        <w:tblLook w:firstColumn="1" w:firstRow="1" w:lastColumn="0" w:lastRow="0" w:noHBand="0" w:noVBand="1" w:val="04A0"/>
+      </w:tblPr>
+      <w:tblGrid>
+        <w:gridCol w:w="1336"/>
+        <w:gridCol w:w="1336"/>
+        <w:gridCol w:w="1336"/>
+        <w:gridCol w:w="1336"/>
+        <w:gridCol w:w="1336"/>
+        <w:gridCol w:w="1336"/>
+        <w:gridCol w:w="1336"/>
+      </w:tblGrid>
+      <w:tr>
+        <w:tc>
+          <w:tcPr>
+            <w:tcW w:type="dxa" w:w="9352"/>
+            <w:gridSpan w:val="7"/>
+          </w:tcPr>
+          <w:p>
+            <w:pPr>
+              <w:jc w:val="center"/>
+            </w:pPr>
+            <w:r>
+              <w:rPr>
+                <w:rFonts w:ascii="Times New Roman" w:hAnsi="Times New Roman"/>
+                <w:b/>
+                <w:sz w:val="24"/>
+              </w:rPr>
+              <w:t>09.02.07.06.001 ПЗ</w:t>
+            </w:r>
+          </w:p>
+        </w:tc>
+      </w:tr>
+      <w:tr>
+        <w:tc>
+          <w:tcPr>
+            <w:tcW w:type="dxa" w:w="1336"/>
+          </w:tcPr>
+          <w:p>
+            <w:pPr>
+              <w:jc w:val="center"/>
+            </w:pPr>
+            <w:r>
+              <w:rPr>
+                <w:rFonts w:ascii="Times New Roman" w:hAnsi="Times New Roman"/>
+                <w:sz w:val="16"/>
+              </w:rPr>
+              <w:t>Изм.</w:t>
+            </w:r>
+          </w:p>
+        </w:tc>
+        <w:tc>
+          <w:tcPr>
+            <w:tcW w:type="dxa" w:w="1336"/>
+          </w:tcPr>
+          <w:p>
+            <w:pPr>
+              <w:jc w:val="center"/>
+            </w:pPr>
+            <w:r>
+              <w:rPr>
+                <w:rFonts w:ascii="Times New Roman" w:hAnsi="Times New Roman"/>
+                <w:sz w:val="16"/>
+              </w:rPr>
+              <w:t>Лист</w:t>
+            </w:r>
+          </w:p>
+        </w:tc>
+        <w:tc>
+          <w:tcPr>
+            <w:tcW w:type="dxa" w:w="1336"/>
+          </w:tcPr>
+          <w:p>
+            <w:pPr>
+              <w:jc w:val="center"/>
+            </w:pPr>
+            <w:r>
+              <w:rPr>
+                <w:rFonts w:ascii="Times New Roman" w:hAnsi="Times New Roman"/>
+                <w:sz w:val="16"/>
+              </w:rPr>
+              <w:t>№ докум.</w:t>
+            </w:r>
+          </w:p>
+        </w:tc>
+        <w:tc>
+          <w:tcPr>
+            <w:tcW w:type="dxa" w:w="1336"/>
+          </w:tcPr>
+          <w:p>
+            <w:pPr>
+              <w:jc w:val="center"/>
+            </w:pPr>
+            <w:r>
+              <w:rPr>
+                <w:rFonts w:ascii="Times New Roman" w:hAnsi="Times New Roman"/>
+                <w:sz w:val="16"/>
+              </w:rPr>
+              <w:t>Подпись</w:t>
+            </w:r>
+          </w:p>
+        </w:tc>
+        <w:tc>
+          <w:tcPr>
+            <w:tcW w:type="dxa" w:w="1336"/>
+          </w:tcPr>
+          <w:p>
+            <w:pPr>
+              <w:jc w:val="center"/>
+            </w:pPr>
+            <w:r>
+              <w:rPr>
+                <w:rFonts w:ascii="Times New Roman" w:hAnsi="Times New Roman"/>
+                <w:sz w:val="16"/>
+              </w:rPr>
+              <w:t>Дата</w:t>
+            </w:r>
+          </w:p>
+        </w:tc>
+        <w:tc>
+          <w:tcPr>
+            <w:tcW w:type="dxa" w:w="2672"/>
+            <w:gridSpan w:val="2"/>
+          </w:tcPr>
+          <w:p/>
+        </w:tc>
+      </w:tr>
+      <w:tr>
+        <w:tc>
+          <w:tcPr>
+            <w:tcW w:type="dxa" w:w="1336"/>
+          </w:tcPr>
+          <w:p>
+            <w:pPr>
+              <w:jc w:val="center"/>
+            </w:pPr>
+            <w:r>
+              <w:rPr>
+                <w:rFonts w:ascii="Times New Roman" w:hAnsi="Times New Roman"/>
+                <w:sz w:val="16"/>
+              </w:rPr>
+              <w:t>Разраб.</w:t>
+            </w:r>
+          </w:p>
+        </w:tc>
+        <w:tc>
+          <w:tcPr>
+            <w:tcW w:type="dxa" w:w="1336"/>
+          </w:tcPr>
+          <w:p>
+            <w:pPr>
+              <w:jc w:val="center"/>
+            </w:pPr>
+            <w:r>
+              <w:rPr>
+                <w:rFonts w:ascii="Times New Roman" w:hAnsi="Times New Roman"/>
+                <w:sz w:val="16"/>
+              </w:rPr>
+            </w:r>
+          </w:p>
+        </w:tc>
+        <w:tc>
+          <w:tcPr>
+            <w:tcW w:type="dxa" w:w="1336"/>
+          </w:tcPr>
+          <w:p>
+            <w:pPr>
+              <w:jc w:val="center"/>
+            </w:pPr>
+            <w:r>
+              <w:rPr>
+                <w:rFonts w:ascii="Times New Roman" w:hAnsi="Times New Roman"/>
+                <w:sz w:val="16"/>
+              </w:rPr>
+            </w:r>
+          </w:p>
+        </w:tc>
+        <w:tc>
+          <w:tcPr>
+            <w:tcW w:type="dxa" w:w="1336"/>
+          </w:tcPr>
+          <w:p>
+            <w:pPr>
+              <w:jc w:val="center"/>
+            </w:pPr>
+            <w:r>
+              <w:rPr>
+                <w:rFonts w:ascii="Times New Roman" w:hAnsi="Times New Roman"/>
+                <w:sz w:val="16"/>
+              </w:rPr>
+            </w:r>
+          </w:p>
+        </w:tc>
+        <w:tc>
+          <w:tcPr>
+            <w:tcW w:type="dxa" w:w="1336"/>
+          </w:tcPr>
+          <w:p>
+            <w:pPr>
+              <w:jc w:val="center"/>
+            </w:pPr>
+            <w:r>
+              <w:rPr>
+                <w:rFonts w:ascii="Times New Roman" w:hAnsi="Times New Roman"/>
+                <w:sz w:val="16"/>
+              </w:rPr>
+            </w:r>
+          </w:p>
+        </w:tc>
+        <w:tc>
+          <w:tcPr>
+            <w:tcW w:type="dxa" w:w="2672"/>
+            <w:gridSpan w:val="2"/>
+          </w:tcPr>
+          <w:p>
+            <w:pPr>
+              <w:jc w:val="center"/>
+            </w:pPr>
+            <w:r>
+              <w:rPr>
+                <w:rFonts w:ascii="Times New Roman" w:hAnsi="Times New Roman"/>
+                <w:b/>
+                <w:sz w:val="20"/>
+              </w:rPr>
+              <w:t>РАЗРАБОТКА ОБРАЗОВАТЕЛЬНОЙ ПЛАТФОРМЫ ДЛЯ ИЗУЧЕНИЯ ПРОГРАММИРОВАНИЯ «CODEPATH»</w:t>
+            </w:r>
+          </w:p>
+        </w:tc>
+      </w:tr>
+      <w:tr>
+        <w:tc>
+          <w:tcPr>
+            <w:tcW w:type="dxa" w:w="1336"/>
+          </w:tcPr>
+          <w:p>
+            <w:pPr>
+              <w:jc w:val="center"/>
+            </w:pPr>
+            <w:r>
+              <w:rPr>
+                <w:rFonts w:ascii="Times New Roman" w:hAnsi="Times New Roman"/>
+                <w:sz w:val="16"/>
+              </w:rPr>
+              <w:t>Провер.</w:t>
+            </w:r>
+          </w:p>
+        </w:tc>
+        <w:tc>
+          <w:tcPr>
+            <w:tcW w:type="dxa" w:w="1336"/>
+          </w:tcPr>
+          <w:p>
+            <w:pPr>
+              <w:jc w:val="center"/>
+            </w:pPr>
+            <w:r>
+              <w:rPr>
+                <w:rFonts w:ascii="Times New Roman" w:hAnsi="Times New Roman"/>
+                <w:sz w:val="16"/>
+              </w:rPr>
+            </w:r>
+          </w:p>
+        </w:tc>
+        <w:tc>
+          <w:tcPr>
+            <w:tcW w:type="dxa" w:w="1336"/>
+          </w:tcPr>
+          <w:p>
+            <w:pPr>
+              <w:jc w:val="center"/>
+            </w:pPr>
+            <w:r>
+              <w:rPr>
+                <w:rFonts w:ascii="Times New Roman" w:hAnsi="Times New Roman"/>
+                <w:sz w:val="16"/>
+              </w:rPr>
+            </w:r>
+          </w:p>
+        </w:tc>
+        <w:tc>
+          <w:tcPr>
+            <w:tcW w:type="dxa" w:w="1336"/>
+          </w:tcPr>
+          <w:p>
+            <w:pPr>
+              <w:jc w:val="center"/>
+            </w:pPr>
+            <w:r>
+              <w:rPr>
+                <w:rFonts w:ascii="Times New Roman" w:hAnsi="Times New Roman"/>
+                <w:sz w:val="16"/>
+              </w:rPr>
+            </w:r>
+          </w:p>
+        </w:tc>
+        <w:tc>
+          <w:tcPr>
+            <w:tcW w:type="dxa" w:w="1336"/>
+          </w:tcPr>
+          <w:p>
+            <w:pPr>
+              <w:jc w:val="center"/>
+            </w:pPr>
+            <w:r>
+              <w:rPr>
+                <w:rFonts w:ascii="Times New Roman" w:hAnsi="Times New Roman"/>
+                <w:sz w:val="16"/>
+              </w:rPr>
+            </w:r>
+          </w:p>
+        </w:tc>
+        <w:tc>
+          <w:tcPr>
+            <w:tcW w:type="dxa" w:w="2672"/>
+            <w:gridSpan w:val="2"/>
+          </w:tcPr>
+          <w:p>
+            <w:pPr>
+              <w:jc w:val="center"/>
+            </w:pPr>
+            <w:r>
+              <w:rPr>
+                <w:rFonts w:ascii="Times New Roman" w:hAnsi="Times New Roman"/>
+                <w:sz w:val="16"/>
+              </w:rPr>
+              <w:t>Лит.        Листов        19</w:t>
+            </w:r>
+          </w:p>
+        </w:tc>
+      </w:tr>
+      <w:tr>
+        <w:tc>
+          <w:tcPr>
+            <w:tcW w:type="dxa" w:w="1336"/>
+          </w:tcPr>
+          <w:p>
+            <w:r>
+              <w:rPr>
+                <w:rFonts w:ascii="Times New Roman" w:hAnsi="Times New Roman"/>
+                <w:sz w:val="16"/>
+              </w:rPr>
+            </w:r>
+          </w:p>
+        </w:tc>
+        <w:tc>
+          <w:tcPr>
+            <w:tcW w:type="dxa" w:w="1336"/>
+          </w:tcPr>
+          <w:p>
+            <w:r>
+              <w:rPr>
+                <w:rFonts w:ascii="Times New Roman" w:hAnsi="Times New Roman"/>
+                <w:sz w:val="16"/>
+              </w:rPr>
+            </w:r>
+          </w:p>
+        </w:tc>
+        <w:tc>
+          <w:tcPr>
+            <w:tcW w:type="dxa" w:w="1336"/>
+          </w:tcPr>
+          <w:p>
+            <w:r>
+              <w:rPr>
+                <w:rFonts w:ascii="Times New Roman" w:hAnsi="Times New Roman"/>
+                <w:sz w:val="16"/>
+              </w:rPr>
+            </w:r>
+          </w:p>
+        </w:tc>
+        <w:tc>
+          <w:tcPr>
+            <w:tcW w:type="dxa" w:w="1336"/>
+          </w:tcPr>
+          <w:p>
+            <w:r>
+              <w:rPr>
+                <w:rFonts w:ascii="Times New Roman" w:hAnsi="Times New Roman"/>
+                <w:sz w:val="16"/>
+              </w:rPr>
+            </w:r>
+          </w:p>
+        </w:tc>
+        <w:tc>
+          <w:tcPr>
+            <w:tcW w:type="dxa" w:w="1336"/>
+          </w:tcPr>
+          <w:p>
+            <w:r>
+              <w:rPr>
+                <w:rFonts w:ascii="Times New Roman" w:hAnsi="Times New Roman"/>
+                <w:sz w:val="16"/>
+              </w:rPr>
+            </w:r>
+          </w:p>
+        </w:tc>
+        <w:tc>
+          <w:tcPr>
+            <w:tcW w:type="dxa" w:w="2672"/>
+            <w:gridSpan w:val="2"/>
+          </w:tcPr>
+          <w:p>
+            <w:pPr>
+              <w:jc w:val="center"/>
+            </w:pPr>
+            <w:r>
+              <w:rPr>
+                <w:rFonts w:ascii="Times New Roman" w:hAnsi="Times New Roman"/>
+                <w:sz w:val="20"/>
+              </w:rPr>
+              <w:t>15.ИСиП.22.ОФ.О.4</w:t>
+            </w:r>
+          </w:p>
+        </w:tc>
+      </w:tr>
+    </w:tbl>
+    <w:p>
+      <w:r>
+        <w:br w:type="page"/>
+      </w:r>
+    </w:p>
+    <w:p>
+      <w:bookmarkStart w:id="1" w:name="bm_contents"/>
       <w:pPr>
         <w:spacing w:before="240" w:after="120"/>
         <w:jc w:val="center"/>
@@ -15,340 +505,421 @@
         </w:rPr>
         <w:t>Содержание</w:t>
       </w:r>
+      <w:bookmarkEnd w:id="1"/>
     </w:p>
     <w:p>
-      <w:r>
-        <w:rPr>
-          <w:rFonts w:ascii="Times New Roman" w:hAnsi="Times New Roman"/>
-          <w:sz w:val="28"/>
-        </w:rPr>
-        <w:t>Введение</w:t>
-      </w:r>
-      <w:r>
-        <w:tab/>
-      </w:r>
-      <w:r>
-        <w:rPr>
-          <w:rFonts w:ascii="Times New Roman" w:hAnsi="Times New Roman"/>
-          <w:sz w:val="28"/>
-        </w:rPr>
-        <w:t>5</w:t>
-      </w:r>
+      <w:hyperlink w:anchor="bm_intro">
+        <w:r>
+          <w:rPr>
+            <w:rStyle w:val="Hyperlink"/>
+            <w:rFonts w:ascii="Times New Roman" w:hAnsi="Times New Roman"/>
+            <w:sz w:val="28"/>
+            <w:color w:val="000000"/>
+            <w:u w:val="none"/>
+          </w:rPr>
+          <w:t xml:space="preserve">Введение</w:t>
+        </w:r>
+        <w:r>
+          <w:rPr>
+            <w:rStyle w:val="Hyperlink"/>
+            <w:rFonts w:ascii="Times New Roman" w:hAnsi="Times New Roman"/>
+            <w:sz w:val="28"/>
+            <w:color w:val="000000"/>
+            <w:u w:val="none"/>
+          </w:rPr>
+          <w:t xml:space="preserve">	5</w:t>
+        </w:r>
+      </w:hyperlink>
     </w:p>
     <w:p>
-      <w:r>
-        <w:rPr>
-          <w:rFonts w:ascii="Times New Roman" w:hAnsi="Times New Roman"/>
-          <w:sz w:val="28"/>
-        </w:rPr>
-        <w:t>Раздел 1. Анализ предметной области</w:t>
-      </w:r>
-      <w:r>
-        <w:tab/>
-      </w:r>
-      <w:r>
-        <w:rPr>
-          <w:rFonts w:ascii="Times New Roman" w:hAnsi="Times New Roman"/>
-          <w:sz w:val="28"/>
-        </w:rPr>
-        <w:t>6</w:t>
-      </w:r>
+      <w:hyperlink w:anchor="bm_r1">
+        <w:r>
+          <w:rPr>
+            <w:rStyle w:val="Hyperlink"/>
+            <w:rFonts w:ascii="Times New Roman" w:hAnsi="Times New Roman"/>
+            <w:sz w:val="28"/>
+            <w:color w:val="000000"/>
+            <w:u w:val="none"/>
+          </w:rPr>
+          <w:t xml:space="preserve">Раздел 1. Анализ предметной области</w:t>
+        </w:r>
+        <w:r>
+          <w:rPr>
+            <w:rStyle w:val="Hyperlink"/>
+            <w:rFonts w:ascii="Times New Roman" w:hAnsi="Times New Roman"/>
+            <w:sz w:val="28"/>
+            <w:color w:val="000000"/>
+            <w:u w:val="none"/>
+          </w:rPr>
+          <w:t xml:space="preserve">	6</w:t>
+        </w:r>
+      </w:hyperlink>
     </w:p>
     <w:p>
       <w:pPr>
         <w:ind w:left="567"/>
       </w:pPr>
-      <w:r>
-        <w:rPr>
-          <w:rFonts w:ascii="Times New Roman" w:hAnsi="Times New Roman"/>
-          <w:sz w:val="28"/>
-        </w:rPr>
-        <w:t>1.1. Сбор данных</w:t>
-      </w:r>
-      <w:r>
-        <w:tab/>
-      </w:r>
-      <w:r>
-        <w:rPr>
-          <w:rFonts w:ascii="Times New Roman" w:hAnsi="Times New Roman"/>
-          <w:sz w:val="28"/>
-        </w:rPr>
-        <w:t>6</w:t>
-      </w:r>
+      <w:hyperlink w:anchor="bm_11">
+        <w:r>
+          <w:rPr>
+            <w:rStyle w:val="Hyperlink"/>
+            <w:rFonts w:ascii="Times New Roman" w:hAnsi="Times New Roman"/>
+            <w:sz w:val="28"/>
+            <w:color w:val="000000"/>
+            <w:u w:val="none"/>
+          </w:rPr>
+          <w:t xml:space="preserve">1.1. Сбор данных</w:t>
+        </w:r>
+        <w:r>
+          <w:rPr>
+            <w:rStyle w:val="Hyperlink"/>
+            <w:rFonts w:ascii="Times New Roman" w:hAnsi="Times New Roman"/>
+            <w:sz w:val="28"/>
+            <w:color w:val="000000"/>
+            <w:u w:val="none"/>
+          </w:rPr>
+          <w:t xml:space="preserve">	6</w:t>
+        </w:r>
+      </w:hyperlink>
     </w:p>
     <w:p>
       <w:pPr>
         <w:ind w:left="567"/>
       </w:pPr>
-      <w:r>
-        <w:rPr>
-          <w:rFonts w:ascii="Times New Roman" w:hAnsi="Times New Roman"/>
-          <w:sz w:val="28"/>
-        </w:rPr>
-        <w:t>1.2. Обоснование необходимости создания автоматизированной системы</w:t>
-      </w:r>
-      <w:r>
-        <w:tab/>
-      </w:r>
-      <w:r>
-        <w:rPr>
-          <w:rFonts w:ascii="Times New Roman" w:hAnsi="Times New Roman"/>
-          <w:sz w:val="28"/>
-        </w:rPr>
-        <w:t>6</w:t>
-      </w:r>
+      <w:hyperlink w:anchor="bm_12">
+        <w:r>
+          <w:rPr>
+            <w:rStyle w:val="Hyperlink"/>
+            <w:rFonts w:ascii="Times New Roman" w:hAnsi="Times New Roman"/>
+            <w:sz w:val="28"/>
+            <w:color w:val="000000"/>
+            <w:u w:val="none"/>
+          </w:rPr>
+          <w:t xml:space="preserve">1.2. Обоснование необходимости создания автоматизированной системы</w:t>
+        </w:r>
+        <w:r>
+          <w:rPr>
+            <w:rStyle w:val="Hyperlink"/>
+            <w:rFonts w:ascii="Times New Roman" w:hAnsi="Times New Roman"/>
+            <w:sz w:val="28"/>
+            <w:color w:val="000000"/>
+            <w:u w:val="none"/>
+          </w:rPr>
+          <w:t xml:space="preserve">	6</w:t>
+        </w:r>
+      </w:hyperlink>
     </w:p>
     <w:p>
       <w:pPr>
         <w:ind w:left="567"/>
       </w:pPr>
-      <w:r>
-        <w:rPr>
-          <w:rFonts w:ascii="Times New Roman" w:hAnsi="Times New Roman"/>
-          <w:sz w:val="28"/>
-        </w:rPr>
-        <w:t>1.3. Предлагаемое решение</w:t>
-      </w:r>
-      <w:r>
-        <w:tab/>
-      </w:r>
-      <w:r>
-        <w:rPr>
-          <w:rFonts w:ascii="Times New Roman" w:hAnsi="Times New Roman"/>
-          <w:sz w:val="28"/>
-        </w:rPr>
-        <w:t>6</w:t>
-      </w:r>
+      <w:hyperlink w:anchor="bm_13">
+        <w:r>
+          <w:rPr>
+            <w:rStyle w:val="Hyperlink"/>
+            <w:rFonts w:ascii="Times New Roman" w:hAnsi="Times New Roman"/>
+            <w:sz w:val="28"/>
+            <w:color w:val="000000"/>
+            <w:u w:val="none"/>
+          </w:rPr>
+          <w:t xml:space="preserve">1.3. Предлагаемое решение</w:t>
+        </w:r>
+        <w:r>
+          <w:rPr>
+            <w:rStyle w:val="Hyperlink"/>
+            <w:rFonts w:ascii="Times New Roman" w:hAnsi="Times New Roman"/>
+            <w:sz w:val="28"/>
+            <w:color w:val="000000"/>
+            <w:u w:val="none"/>
+          </w:rPr>
+          <w:t xml:space="preserve">	6</w:t>
+        </w:r>
+      </w:hyperlink>
     </w:p>
     <w:p>
-      <w:r>
-        <w:rPr>
-          <w:rFonts w:ascii="Times New Roman" w:hAnsi="Times New Roman"/>
-          <w:sz w:val="28"/>
-        </w:rPr>
-        <w:t>Раздел 2. Технология разработки программного продукта заказчика</w:t>
-      </w:r>
-      <w:r>
-        <w:tab/>
-      </w:r>
-      <w:r>
-        <w:rPr>
-          <w:rFonts w:ascii="Times New Roman" w:hAnsi="Times New Roman"/>
-          <w:sz w:val="28"/>
-        </w:rPr>
-        <w:t>7</w:t>
-      </w:r>
+      <w:hyperlink w:anchor="bm_r2">
+        <w:r>
+          <w:rPr>
+            <w:rStyle w:val="Hyperlink"/>
+            <w:rFonts w:ascii="Times New Roman" w:hAnsi="Times New Roman"/>
+            <w:sz w:val="28"/>
+            <w:color w:val="000000"/>
+            <w:u w:val="none"/>
+          </w:rPr>
+          <w:t xml:space="preserve">Раздел 2. Технология разработки программного продукта заказчика</w:t>
+        </w:r>
+        <w:r>
+          <w:rPr>
+            <w:rStyle w:val="Hyperlink"/>
+            <w:rFonts w:ascii="Times New Roman" w:hAnsi="Times New Roman"/>
+            <w:sz w:val="28"/>
+            <w:color w:val="000000"/>
+            <w:u w:val="none"/>
+          </w:rPr>
+          <w:t xml:space="preserve">	7</w:t>
+        </w:r>
+      </w:hyperlink>
     </w:p>
     <w:p>
       <w:pPr>
         <w:ind w:left="567"/>
       </w:pPr>
-      <w:r>
-        <w:rPr>
-          <w:rFonts w:ascii="Times New Roman" w:hAnsi="Times New Roman"/>
-          <w:sz w:val="28"/>
-        </w:rPr>
-        <w:t>2.1. Описание разработки программного изделия</w:t>
-      </w:r>
-      <w:r>
-        <w:tab/>
-      </w:r>
-      <w:r>
-        <w:rPr>
-          <w:rFonts w:ascii="Times New Roman" w:hAnsi="Times New Roman"/>
-          <w:sz w:val="28"/>
-        </w:rPr>
-        <w:t>7</w:t>
-      </w:r>
+      <w:hyperlink w:anchor="bm_21">
+        <w:r>
+          <w:rPr>
+            <w:rStyle w:val="Hyperlink"/>
+            <w:rFonts w:ascii="Times New Roman" w:hAnsi="Times New Roman"/>
+            <w:sz w:val="28"/>
+            <w:color w:val="000000"/>
+            <w:u w:val="none"/>
+          </w:rPr>
+          <w:t xml:space="preserve">2.1. Описание разработки программного изделия</w:t>
+        </w:r>
+        <w:r>
+          <w:rPr>
+            <w:rStyle w:val="Hyperlink"/>
+            <w:rFonts w:ascii="Times New Roman" w:hAnsi="Times New Roman"/>
+            <w:sz w:val="28"/>
+            <w:color w:val="000000"/>
+            <w:u w:val="none"/>
+          </w:rPr>
+          <w:t xml:space="preserve">	7</w:t>
+        </w:r>
+      </w:hyperlink>
     </w:p>
     <w:p>
       <w:pPr>
         <w:ind w:left="567"/>
       </w:pPr>
-      <w:r>
-        <w:rPr>
-          <w:rFonts w:ascii="Times New Roman" w:hAnsi="Times New Roman"/>
-          <w:sz w:val="28"/>
-        </w:rPr>
-        <w:t>2.2. Описание программного продукта</w:t>
-      </w:r>
-      <w:r>
-        <w:tab/>
-      </w:r>
-      <w:r>
-        <w:rPr>
-          <w:rFonts w:ascii="Times New Roman" w:hAnsi="Times New Roman"/>
-          <w:sz w:val="28"/>
-        </w:rPr>
-        <w:t>7</w:t>
-      </w:r>
+      <w:hyperlink w:anchor="bm_22">
+        <w:r>
+          <w:rPr>
+            <w:rStyle w:val="Hyperlink"/>
+            <w:rFonts w:ascii="Times New Roman" w:hAnsi="Times New Roman"/>
+            <w:sz w:val="28"/>
+            <w:color w:val="000000"/>
+            <w:u w:val="none"/>
+          </w:rPr>
+          <w:t xml:space="preserve">2.2. Описание программного продукта</w:t>
+        </w:r>
+        <w:r>
+          <w:rPr>
+            <w:rStyle w:val="Hyperlink"/>
+            <w:rFonts w:ascii="Times New Roman" w:hAnsi="Times New Roman"/>
+            <w:sz w:val="28"/>
+            <w:color w:val="000000"/>
+            <w:u w:val="none"/>
+          </w:rPr>
+          <w:t xml:space="preserve">	7</w:t>
+        </w:r>
+      </w:hyperlink>
     </w:p>
     <w:p>
       <w:pPr>
         <w:ind w:left="567"/>
       </w:pPr>
-      <w:r>
-        <w:rPr>
-          <w:rFonts w:ascii="Times New Roman" w:hAnsi="Times New Roman"/>
-          <w:sz w:val="28"/>
-        </w:rPr>
-        <w:t>2.2.1. Выбор среды программирования</w:t>
-      </w:r>
-      <w:r>
-        <w:tab/>
-      </w:r>
-      <w:r>
-        <w:rPr>
-          <w:rFonts w:ascii="Times New Roman" w:hAnsi="Times New Roman"/>
-          <w:sz w:val="28"/>
-        </w:rPr>
-        <w:t>7</w:t>
-      </w:r>
+      <w:hyperlink w:anchor="bm_221">
+        <w:r>
+          <w:rPr>
+            <w:rStyle w:val="Hyperlink"/>
+            <w:rFonts w:ascii="Times New Roman" w:hAnsi="Times New Roman"/>
+            <w:sz w:val="28"/>
+            <w:color w:val="000000"/>
+            <w:u w:val="none"/>
+          </w:rPr>
+          <w:t xml:space="preserve">2.2.1. Выбор среды программирования</w:t>
+        </w:r>
+        <w:r>
+          <w:rPr>
+            <w:rStyle w:val="Hyperlink"/>
+            <w:rFonts w:ascii="Times New Roman" w:hAnsi="Times New Roman"/>
+            <w:sz w:val="28"/>
+            <w:color w:val="000000"/>
+            <w:u w:val="none"/>
+          </w:rPr>
+          <w:t xml:space="preserve">	7</w:t>
+        </w:r>
+      </w:hyperlink>
     </w:p>
     <w:p>
       <w:pPr>
         <w:ind w:left="567"/>
       </w:pPr>
-      <w:r>
-        <w:rPr>
-          <w:rFonts w:ascii="Times New Roman" w:hAnsi="Times New Roman"/>
-          <w:sz w:val="28"/>
-        </w:rPr>
-        <w:t>2.2.2. Структура информационной системы проекта</w:t>
-      </w:r>
-      <w:r>
-        <w:tab/>
-      </w:r>
-      <w:r>
-        <w:rPr>
-          <w:rFonts w:ascii="Times New Roman" w:hAnsi="Times New Roman"/>
-          <w:sz w:val="28"/>
-        </w:rPr>
-        <w:t>8</w:t>
-      </w:r>
+      <w:hyperlink w:anchor="bm_222">
+        <w:r>
+          <w:rPr>
+            <w:rStyle w:val="Hyperlink"/>
+            <w:rFonts w:ascii="Times New Roman" w:hAnsi="Times New Roman"/>
+            <w:sz w:val="28"/>
+            <w:color w:val="000000"/>
+            <w:u w:val="none"/>
+          </w:rPr>
+          <w:t xml:space="preserve">2.2.2. Структура информационной системы проекта</w:t>
+        </w:r>
+        <w:r>
+          <w:rPr>
+            <w:rStyle w:val="Hyperlink"/>
+            <w:rFonts w:ascii="Times New Roman" w:hAnsi="Times New Roman"/>
+            <w:sz w:val="28"/>
+            <w:color w:val="000000"/>
+            <w:u w:val="none"/>
+          </w:rPr>
+          <w:t xml:space="preserve">	8</w:t>
+        </w:r>
+      </w:hyperlink>
     </w:p>
     <w:p>
-      <w:r>
-        <w:rPr>
-          <w:rFonts w:ascii="Times New Roman" w:hAnsi="Times New Roman"/>
-          <w:sz w:val="28"/>
-        </w:rPr>
-        <w:t>Раздел 3. Организация работ по внедрению программного продукта</w:t>
-      </w:r>
-      <w:r>
-        <w:tab/>
-      </w:r>
-      <w:r>
-        <w:rPr>
-          <w:rFonts w:ascii="Times New Roman" w:hAnsi="Times New Roman"/>
-          <w:sz w:val="28"/>
-        </w:rPr>
-        <w:t>9</w:t>
-      </w:r>
+      <w:hyperlink w:anchor="bm_r3">
+        <w:r>
+          <w:rPr>
+            <w:rStyle w:val="Hyperlink"/>
+            <w:rFonts w:ascii="Times New Roman" w:hAnsi="Times New Roman"/>
+            <w:sz w:val="28"/>
+            <w:color w:val="000000"/>
+            <w:u w:val="none"/>
+          </w:rPr>
+          <w:t xml:space="preserve">Раздел 3. Организация работ по внедрению программного продукта</w:t>
+        </w:r>
+        <w:r>
+          <w:rPr>
+            <w:rStyle w:val="Hyperlink"/>
+            <w:rFonts w:ascii="Times New Roman" w:hAnsi="Times New Roman"/>
+            <w:sz w:val="28"/>
+            <w:color w:val="000000"/>
+            <w:u w:val="none"/>
+          </w:rPr>
+          <w:t xml:space="preserve">	9</w:t>
+        </w:r>
+      </w:hyperlink>
     </w:p>
     <w:p>
       <w:pPr>
         <w:ind w:left="567"/>
       </w:pPr>
-      <w:r>
-        <w:rPr>
-          <w:rFonts w:ascii="Times New Roman" w:hAnsi="Times New Roman"/>
-          <w:sz w:val="28"/>
-        </w:rPr>
-        <w:t>3.1. Установка и настройка компонентов программного продукта</w:t>
-      </w:r>
-      <w:r>
-        <w:tab/>
-      </w:r>
-      <w:r>
-        <w:rPr>
-          <w:rFonts w:ascii="Times New Roman" w:hAnsi="Times New Roman"/>
-          <w:sz w:val="28"/>
-        </w:rPr>
-        <w:t>9</w:t>
-      </w:r>
+      <w:hyperlink w:anchor="bm_31">
+        <w:r>
+          <w:rPr>
+            <w:rStyle w:val="Hyperlink"/>
+            <w:rFonts w:ascii="Times New Roman" w:hAnsi="Times New Roman"/>
+            <w:sz w:val="28"/>
+            <w:color w:val="000000"/>
+            <w:u w:val="none"/>
+          </w:rPr>
+          <w:t xml:space="preserve">3.1. Установка и настройка компонентов программного продукта</w:t>
+        </w:r>
+        <w:r>
+          <w:rPr>
+            <w:rStyle w:val="Hyperlink"/>
+            <w:rFonts w:ascii="Times New Roman" w:hAnsi="Times New Roman"/>
+            <w:sz w:val="28"/>
+            <w:color w:val="000000"/>
+            <w:u w:val="none"/>
+          </w:rPr>
+          <w:t xml:space="preserve">	9</w:t>
+        </w:r>
+      </w:hyperlink>
     </w:p>
     <w:p>
       <w:pPr>
         <w:ind w:left="567"/>
       </w:pPr>
-      <w:r>
-        <w:rPr>
-          <w:rFonts w:ascii="Times New Roman" w:hAnsi="Times New Roman"/>
-          <w:sz w:val="28"/>
-        </w:rPr>
-        <w:t>3.2. Тестирование компонентов программного продукта</w:t>
-      </w:r>
-      <w:r>
-        <w:tab/>
-      </w:r>
-      <w:r>
-        <w:rPr>
-          <w:rFonts w:ascii="Times New Roman" w:hAnsi="Times New Roman"/>
-          <w:sz w:val="28"/>
-        </w:rPr>
-        <w:t>9</w:t>
-      </w:r>
+      <w:hyperlink w:anchor="bm_32">
+        <w:r>
+          <w:rPr>
+            <w:rStyle w:val="Hyperlink"/>
+            <w:rFonts w:ascii="Times New Roman" w:hAnsi="Times New Roman"/>
+            <w:sz w:val="28"/>
+            <w:color w:val="000000"/>
+            <w:u w:val="none"/>
+          </w:rPr>
+          <w:t xml:space="preserve">3.2. Тестирование компонентов программного продукта</w:t>
+        </w:r>
+        <w:r>
+          <w:rPr>
+            <w:rStyle w:val="Hyperlink"/>
+            <w:rFonts w:ascii="Times New Roman" w:hAnsi="Times New Roman"/>
+            <w:sz w:val="28"/>
+            <w:color w:val="000000"/>
+            <w:u w:val="none"/>
+          </w:rPr>
+          <w:t xml:space="preserve">	9</w:t>
+        </w:r>
+      </w:hyperlink>
     </w:p>
     <w:p>
       <w:pPr>
         <w:ind w:left="567"/>
       </w:pPr>
-      <w:r>
-        <w:rPr>
-          <w:rFonts w:ascii="Times New Roman" w:hAnsi="Times New Roman"/>
-          <w:sz w:val="28"/>
-        </w:rPr>
-        <w:t>3.3. Расчет технико-экономических показателей</w:t>
-      </w:r>
-      <w:r>
-        <w:tab/>
-      </w:r>
-      <w:r>
-        <w:rPr>
-          <w:rFonts w:ascii="Times New Roman" w:hAnsi="Times New Roman"/>
-          <w:sz w:val="28"/>
-        </w:rPr>
-        <w:t>9</w:t>
-      </w:r>
+      <w:hyperlink w:anchor="bm_33">
+        <w:r>
+          <w:rPr>
+            <w:rStyle w:val="Hyperlink"/>
+            <w:rFonts w:ascii="Times New Roman" w:hAnsi="Times New Roman"/>
+            <w:sz w:val="28"/>
+            <w:color w:val="000000"/>
+            <w:u w:val="none"/>
+          </w:rPr>
+          <w:t xml:space="preserve">3.3. Расчет технико-экономических показателей</w:t>
+        </w:r>
+        <w:r>
+          <w:rPr>
+            <w:rStyle w:val="Hyperlink"/>
+            <w:rFonts w:ascii="Times New Roman" w:hAnsi="Times New Roman"/>
+            <w:sz w:val="28"/>
+            <w:color w:val="000000"/>
+            <w:u w:val="none"/>
+          </w:rPr>
+          <w:t xml:space="preserve">	9</w:t>
+        </w:r>
+      </w:hyperlink>
     </w:p>
     <w:p>
-      <w:r>
-        <w:rPr>
-          <w:rFonts w:ascii="Times New Roman" w:hAnsi="Times New Roman"/>
-          <w:sz w:val="28"/>
-        </w:rPr>
-        <w:t>Заключение</w:t>
-      </w:r>
-      <w:r>
-        <w:tab/>
-      </w:r>
-      <w:r>
-        <w:rPr>
-          <w:rFonts w:ascii="Times New Roman" w:hAnsi="Times New Roman"/>
-          <w:sz w:val="28"/>
-        </w:rPr>
-        <w:t>15</w:t>
-      </w:r>
+      <w:hyperlink w:anchor="bm_conclusion">
+        <w:r>
+          <w:rPr>
+            <w:rStyle w:val="Hyperlink"/>
+            <w:rFonts w:ascii="Times New Roman" w:hAnsi="Times New Roman"/>
+            <w:sz w:val="28"/>
+            <w:color w:val="000000"/>
+            <w:u w:val="none"/>
+          </w:rPr>
+          <w:t xml:space="preserve">Заключение</w:t>
+        </w:r>
+        <w:r>
+          <w:rPr>
+            <w:rStyle w:val="Hyperlink"/>
+            <w:rFonts w:ascii="Times New Roman" w:hAnsi="Times New Roman"/>
+            <w:sz w:val="28"/>
+            <w:color w:val="000000"/>
+            <w:u w:val="none"/>
+          </w:rPr>
+          <w:t xml:space="preserve">	15</w:t>
+        </w:r>
+      </w:hyperlink>
     </w:p>
     <w:p>
-      <w:r>
-        <w:rPr>
-          <w:rFonts w:ascii="Times New Roman" w:hAnsi="Times New Roman"/>
-          <w:sz w:val="28"/>
-        </w:rPr>
-        <w:t>Список используемой литературы</w:t>
-      </w:r>
-      <w:r>
-        <w:tab/>
-      </w:r>
-      <w:r>
-        <w:rPr>
-          <w:rFonts w:ascii="Times New Roman" w:hAnsi="Times New Roman"/>
-          <w:sz w:val="28"/>
-        </w:rPr>
-        <w:t>16</w:t>
-      </w:r>
+      <w:hyperlink w:anchor="bm_lit">
+        <w:r>
+          <w:rPr>
+            <w:rStyle w:val="Hyperlink"/>
+            <w:rFonts w:ascii="Times New Roman" w:hAnsi="Times New Roman"/>
+            <w:sz w:val="28"/>
+            <w:color w:val="000000"/>
+            <w:u w:val="none"/>
+          </w:rPr>
+          <w:t xml:space="preserve">Список используемой литературы</w:t>
+        </w:r>
+        <w:r>
+          <w:rPr>
+            <w:rStyle w:val="Hyperlink"/>
+            <w:rFonts w:ascii="Times New Roman" w:hAnsi="Times New Roman"/>
+            <w:sz w:val="28"/>
+            <w:color w:val="000000"/>
+            <w:u w:val="none"/>
+          </w:rPr>
+          <w:t xml:space="preserve">	16</w:t>
+        </w:r>
+      </w:hyperlink>
     </w:p>
     <w:p>
       <w:pPr>
@@ -392,6 +963,7 @@
       </w:r>
     </w:p>
     <w:p>
+      <w:bookmarkStart w:id="2" w:name="bm_intro"/>
       <w:pPr>
         <w:spacing w:before="240" w:after="120"/>
         <w:jc w:val="center"/>
@@ -404,6 +976,7 @@
         </w:rPr>
         <w:t>Введение</w:t>
       </w:r>
+      <w:bookmarkEnd w:id="2"/>
     </w:p>
     <w:p>
       <w:pPr>
@@ -632,6 +1205,7 @@
       </w:r>
     </w:p>
     <w:p>
+      <w:bookmarkStart w:id="3" w:name="bm_r1"/>
       <w:pPr>
         <w:spacing w:before="240" w:after="120"/>
         <w:jc w:val="center"/>
@@ -644,8 +1218,10 @@
         </w:rPr>
         <w:t>Раздел 1. Анализ предметной области</w:t>
       </w:r>
+      <w:bookmarkEnd w:id="3"/>
     </w:p>
     <w:p>
+      <w:bookmarkStart w:id="4" w:name="bm_11"/>
       <w:pPr>
         <w:spacing w:before="240" w:after="120"/>
         <w:jc w:val="center"/>
@@ -658,6 +1234,7 @@
         </w:rPr>
         <w:t>1.1 Сбор данных</w:t>
       </w:r>
+      <w:bookmarkEnd w:id="4"/>
     </w:p>
     <w:p>
       <w:pPr>
@@ -812,7 +1389,7 @@
           <w:rFonts w:ascii="Times New Roman" w:hAnsi="Times New Roman"/>
           <w:sz w:val="28"/>
         </w:rPr>
-        <w:t>– учащиеся выполняют регистрацию и ведение личного профиля (заполнение имени, выбор аватара), просмотр каталога доступных курсов, запись на курсы, прохождение теоретических уроков с чтением материалов, выполнение квизов с немедленной обратной связью и объяснениями ответов, решение практических задач с написанием кода в встроенном редакторе и проверкой через тест-кейсы, отслеживание прогресса (завершённые уроки, заработанные XP, текущий уровень), поддержание серий обучения (streak) и получение достижений, а также участие в глобальной таблице лидеров;</w:t>
+        <w:t>– учащиеся выполняют регистрацию и ведение личного профиля, просмотр каталога доступных курсов, запись на курсы, прохождение теоретических уроков, выполнение квизов с немедленной обратной связью и объяснениями ответов, решение практических задач с написанием кода в встроенном редакторе и проверкой через тест-кейсы, отслеживание прогресса, поддержание серий обучения (streak) и получение достижений, а также участие в глобальной таблице лидеров;</w:t>
       </w:r>
     </w:p>
     <w:p>
@@ -825,7 +1402,7 @@
           <w:rFonts w:ascii="Times New Roman" w:hAnsi="Times New Roman"/>
           <w:sz w:val="28"/>
         </w:rPr>
-        <w:t>– преподаватели-авторы контента выполняют создание курсов с описанием, уровнем сложности и языком программирования, организацию курса в модули и уроки, наполнение теоретических уроков учебным материалом в формате Markdown, формулирование вопросов квизов с вариантами ответов и объяснениями, создание практических заданий с инструкциями, стартовым кодом, подсказками и тест-кейсами;</w:t>
+        <w:t>– преподаватели-авторы контента выполняют создание курсов с описанием, уровнем сложности и языком программирования, организацию курса в модули и уроки, наполнение теоретических уроков учебным материалом, формулирование вопросов квизов с вариантами ответов и объяснениями, создание практических заданий с инструкциями, стартовым кодом, подсказками и тест-кейсами;</w:t>
       </w:r>
     </w:p>
     <w:p>
@@ -838,7 +1415,7 @@
           <w:rFonts w:ascii="Times New Roman" w:hAnsi="Times New Roman"/>
           <w:sz w:val="28"/>
         </w:rPr>
-        <w:t>– администратор системы выполняет управление учётными записями и ролями пользователей, настройку прав доступа, создание и управление контентом через административную панель, мониторинг статистики платформы (количество пользователей, курсов, завершённых уроков), поддержку работоспособности информационной системы.</w:t>
+        <w:t>– администратор системы выполняет управление учётными записями и ролями пользователей, настройку прав доступа, создание и управление контентом через административную панель, мониторинг статистики платформы, поддержку работоспособности информационной системы.</w:t>
       </w:r>
     </w:p>
     <w:p>
@@ -864,7 +1441,7 @@
           <w:rFonts w:ascii="Times New Roman" w:hAnsi="Times New Roman"/>
           <w:sz w:val="28"/>
         </w:rPr>
-        <w:t>– пользовательские данные включают параметры учётной записи (уникальный идентификатор, имя пользователя, хэш пароля, адрес электронной почты, дата регистрации), сведения профиля (аватар, отображаемое имя), а также системные параметры (роль на платформе — администратор или пользователь);</w:t>
+        <w:t>– пользовательские данные включают параметры учётной записи (уникальный идентификатор, имя пользователя, хэш пароля, адрес электронной почты, дата регистрации), сведения профиля (аватар, отображаемое имя), а также системные параметры (роль на платформе);</w:t>
       </w:r>
     </w:p>
     <w:p>
@@ -890,7 +1467,7 @@
           <w:rFonts w:ascii="Times New Roman" w:hAnsi="Times New Roman"/>
           <w:sz w:val="28"/>
         </w:rPr>
-        <w:t>– данные курсов и обучения включают структуру курсов (курсы, модули, уроки), описание курсов (название, язык, сложность, количество уроков, расчётное время прохождения, награда в XP), содержание уроков (теоретический текст в Markdown, вопросы квизов с вариантами и правильными ответами, задачи с инструкциями и стартовым кодом), а также тест-кейсы для проверки решений (входные данные, ожидаемый результат);</w:t>
+        <w:t>– данные курсов и обучения включают структуру курсов (курсы, модули, уроки), описание курсов (название, язык, сложность, количество уроков, расчётное время прохождения, награда в XP), содержание уроков, а также тест-кейсы для проверки решений;</w:t>
       </w:r>
     </w:p>
     <w:p>
@@ -903,7 +1480,7 @@
           <w:rFonts w:ascii="Times New Roman" w:hAnsi="Times New Roman"/>
           <w:sz w:val="28"/>
         </w:rPr>
-        <w:t>– данные прогресса пользователя включают записи о завершённых уроках (идентификатор пользователя, идентификатор урока, дата завершения, полученные XP), записи о записях на курсы (дата начала, статус завершения, прогресс);</w:t>
+        <w:t>– данные прогресса пользователя включают записи о завершённых уроках, записи о записях на курсы (дата начала, статус завершения, прогресс);</w:t>
       </w:r>
     </w:p>
     <w:p>
@@ -920,6 +1497,7 @@
       </w:r>
     </w:p>
     <w:p>
+      <w:bookmarkStart w:id="5" w:name="bm_12"/>
       <w:pPr>
         <w:spacing w:before="240" w:after="120"/>
         <w:jc w:val="center"/>
@@ -932,6 +1510,7 @@
         </w:rPr>
         <w:t>1.2. Обоснование необходимости создания автоматизированной системы</w:t>
       </w:r>
+      <w:bookmarkEnd w:id="5"/>
     </w:p>
     <w:p>
       <w:pPr>
@@ -1012,6 +1591,7 @@
       </w:r>
     </w:p>
     <w:p>
+      <w:bookmarkStart w:id="6" w:name="bm_13"/>
       <w:pPr>
         <w:spacing w:before="240" w:after="120"/>
         <w:jc w:val="center"/>
@@ -1024,6 +1604,7 @@
         </w:rPr>
         <w:t>1.3. Предлагаемое решение</w:t>
       </w:r>
+      <w:bookmarkEnd w:id="6"/>
     </w:p>
     <w:p>
       <w:pPr>
@@ -1061,7 +1642,7 @@
           <w:rFonts w:ascii="Times New Roman" w:hAnsi="Times New Roman"/>
           <w:sz w:val="28"/>
         </w:rPr>
-        <w:t>– обеспечение эффективной организации и долгосрочного сохранения учебного контента. Для этого необходимы инструменты для создания, каталогизации и управления теоретическими уроками, квизами и практическими заданиями, с удобной системой навигации и отслеживания прогресса;</w:t>
+        <w:t>– обеспечение эффективной организации и долгосрочного сохранения учебного контента;</w:t>
       </w:r>
     </w:p>
     <w:p>
@@ -1074,7 +1655,7 @@
           <w:rFonts w:ascii="Times New Roman" w:hAnsi="Times New Roman"/>
           <w:sz w:val="28"/>
         </w:rPr>
-        <w:t>– предоставление встроенной среды выполнения кода с автоматической проверкой решений и мгновенной обратной связью, позволяющей практиковаться прямо в браузере без установки дополнительного программного обеспечения;</w:t>
+        <w:t>– предоставление встроенной среды выполнения кода с автоматической проверкой решений и мгновенной обратной связью;</w:t>
       </w:r>
     </w:p>
     <w:p>
@@ -1096,6 +1677,7 @@
       </w:r>
     </w:p>
     <w:p>
+      <w:bookmarkStart w:id="7" w:name="bm_r2"/>
       <w:pPr>
         <w:spacing w:before="240" w:after="120"/>
         <w:jc w:val="center"/>
@@ -1108,8 +1690,10 @@
         </w:rPr>
         <w:t>Раздел 2. Технология разработки программного продукта заказчика</w:t>
       </w:r>
+      <w:bookmarkEnd w:id="7"/>
     </w:p>
     <w:p>
+      <w:bookmarkStart w:id="8" w:name="bm_21"/>
       <w:pPr>
         <w:spacing w:before="240" w:after="120"/>
         <w:jc w:val="center"/>
@@ -1122,6 +1706,7 @@
         </w:rPr>
         <w:t>2.1. Описание разработки программного изделия</w:t>
       </w:r>
+      <w:bookmarkEnd w:id="8"/>
     </w:p>
     <w:p>
       <w:pPr>
@@ -1146,7 +1731,7 @@
           <w:rFonts w:ascii="Times New Roman" w:hAnsi="Times New Roman"/>
           <w:sz w:val="28"/>
         </w:rPr>
-        <w:t>При проектировании была принята клиент-серверная модель: клиентская часть отвечает за страницы и пользовательские сценарии (каталог курсов, прохождение уроков, профиль, таблица лидеров, достижения), а серверная — за API-методы, которые обрабатывают запросы, выполняют проверки, работают с базой данных, выполняют код пользователя и возвращают данные в удобном для интерфейса виде. Для хранения данных используется реляционная БД PostgreSQL, а доступ к данным реализован через Drizzle ORM; на уровне схемы описаны пользователи, курсы, модули, уроки, квизы, задачи, прогресс, геймификация и другие сущности, необходимые для работы платформы.</w:t>
+        <w:t>При проектировании была принята клиент-серверная модель: клиентская часть отвечает за страницы и пользовательские сценарии (каталог курсов, прохождение уроков, профиль, таблица лидеров, достижения), а серверная — за API-методы, которые обрабатывают запросы, выполняют проверки, работают с базой данных, выполняют код пользователя и возвращают данные в удобном для интерфейса виде. Для хранения данных используется реляционная БД PostgreSQL, а доступ к данным реализован через Drizzle ORM.</w:t>
       </w:r>
     </w:p>
     <w:p>
@@ -1159,7 +1744,7 @@
           <w:rFonts w:ascii="Times New Roman" w:hAnsi="Times New Roman"/>
           <w:sz w:val="28"/>
         </w:rPr>
-        <w:t>В ходе разработки система была разделена на логические модули: модуль аутентификации и сессий (регистрация, вход, JWT-токены), модуль профиля и настроек, модуль курсов и уроков (каталог, запись, прохождение), модуль квизов (вопросы, варианты ответов, проверка), модуль практических заданий (редактор кода, выполнение, проверка через тест-кейсы), модуль геймификации (XP, уровни, серии, достижения, таблица лидеров), а также административный модуль (управление контентом и пользователями). Такой подход позволяет изолировать ответственность компонентов и упрощает дальнейшее расширение функционала.</w:t>
+        <w:t>В ходе разработки система была разделена на логические модули: модуль аутентификации и сессий (регистрация, вход, JWT-токены), модуль профиля и настроек, модуль курсов и уроков (каталог, запись, прохождение), модуль квизов (вопросы, варианты ответов, проверка), модуль практических заданий (редактор кода, выполнение, проверка через тест-кейсы), модуль геймификации (XP, уровни, серии, достижения, таблица лидеров), а также административный модуль (управление контентом и пользователями).</w:t>
       </w:r>
     </w:p>
     <w:p>
@@ -1172,10 +1757,11 @@
           <w:rFonts w:ascii="Times New Roman" w:hAnsi="Times New Roman"/>
           <w:sz w:val="28"/>
         </w:rPr>
-        <w:t>Отдельно в проект заложена система выполнения пользовательского кода через серверный модуль CodeRunner, который поддерживает запуск программ на Python и JavaScript через дочерние процессы (child_process), а также базовую проверку HTML, CSS и SQL через сопоставление с образцом. Для обеспечения безопасности применяются ограничения по времени выполнения и фильтрация потенциально опасных конструкций.</w:t>
+        <w:t>Отдельно в проект заложена система выполнения пользовательского кода через серверный модуль CodeRunner, который поддерживает запуск программ на Python и JavaScript через дочерние процессы (child_process), а также базовую проверку HTML, CSS и SQL через сопоставление с образцом.</w:t>
       </w:r>
     </w:p>
     <w:p>
+      <w:bookmarkStart w:id="9" w:name="bm_22"/>
       <w:pPr>
         <w:spacing w:before="240" w:after="120"/>
         <w:jc w:val="center"/>
@@ -1188,6 +1774,7 @@
         </w:rPr>
         <w:t>2.1.1. Требования к функциональным характеристикам</w:t>
       </w:r>
+      <w:bookmarkEnd w:id="9"/>
     </w:p>
     <w:p>
       <w:pPr>
@@ -1238,7 +1825,7 @@
           <w:rFonts w:ascii="Times New Roman" w:hAnsi="Times New Roman"/>
           <w:sz w:val="28"/>
         </w:rPr>
-        <w:t>Система геймификации должна обеспечивать начисление очков опыта (XP) за выполненные уроки, автоматический расчёт уровня пользователя, отслеживание серий ежедневного обучения (streak), присвоение достижений при выполнении определённых условий (первый урок, 5 уроков, 7-дневная серия и т.д.) и глобальную таблицу лидеров с ранжированием по XP.</w:t>
+        <w:t>Система геймификации должна обеспечивать начисление очков опыта (XP) за выполненные уроки, автоматический расчёт уровня пользователя, отслеживание серий ежедневного обучения (streak), присвоение достижений при выполнении определённых условий и глобальную таблицу лидеров с ранжированием по XP.</w:t>
       </w:r>
     </w:p>
     <w:p>
@@ -1278,7 +1865,7 @@
           <w:rFonts w:ascii="Times New Roman" w:hAnsi="Times New Roman"/>
           <w:sz w:val="28"/>
         </w:rPr>
-        <w:t>Надёжность программного продукта CodePath должна обеспечиваться за счёт предсказуемой обработки ошибок, строгой проверки входных данных и устойчивости к сбоям. На уровне серверной логики все запросы должны проходить валидацию: для операций, связанных с пользовательским контентом, требуется отсеивать пустые значения, проверять корректность связей между объектами и возвращать однозначные коды ошибок, чтобы интерфейс мог корректно реагировать на отказ, не приводя систему в неконсистентное состояние.</w:t>
+        <w:t>Надёжность программного продукта CodePath должна обеспечиваться за счёт предсказуемой обработки ошибок, строгой проверки входных данных и устойчивости к сбоям. На уровне серверной логики все запросы должны проходить валидацию с возвратом статусов 400/401/404 и защитной обработкой исключений.</w:t>
       </w:r>
     </w:p>
     <w:p>
@@ -1291,208 +1878,11 @@
           <w:rFonts w:ascii="Times New Roman" w:hAnsi="Times New Roman"/>
           <w:sz w:val="28"/>
         </w:rPr>
-        <w:t>Постоянные данные должны храниться в СУБД PostgreSQL, а доступ к ним выполняться через слой ORM; при эксплуатации необходимо исключать «тихие» сбои соединений и деградацию производительности за счёт ограничения пула подключений и использования защищённого соединения в производственной среде.</w:t>
+        <w:t>Постоянные данные должны храниться в СУБД PostgreSQL, а доступ к ним выполняться через слой ORM. Модуль выполнения пользовательского кода должен быть изолирован от основного серверного процесса, иметь ограничение по времени выполнения (таймаут) и фильтрацию потенциально опасных конструкций.</w:t>
       </w:r>
     </w:p>
     <w:p>
-      <w:pPr>
-        <w:ind w:firstLine="709"/>
-        <w:jc w:val="both"/>
-      </w:pPr>
-      <w:r>
-        <w:rPr>
-          <w:rFonts w:ascii="Times New Roman" w:hAnsi="Times New Roman"/>
-          <w:sz w:val="28"/>
-        </w:rPr>
-        <w:t>Модуль выполнения пользовательского кода должен быть изолирован от основного серверного процесса, иметь ограничение по времени выполнения (таймаут) и фильтрацию потенциально опасных конструкций для предотвращения злоупотреблений.</w:t>
-      </w:r>
-    </w:p>
-    <w:p>
-      <w:pPr>
-        <w:spacing w:before="240" w:after="120"/>
-        <w:jc w:val="center"/>
-      </w:pPr>
-      <w:r>
-        <w:rPr>
-          <w:rFonts w:ascii="Times New Roman" w:hAnsi="Times New Roman"/>
-          <w:b/>
-          <w:sz w:val="28"/>
-        </w:rPr>
-        <w:t>2.1.3. Требования к составу и параметрам технических средств</w:t>
-      </w:r>
-    </w:p>
-    <w:p>
-      <w:pPr>
-        <w:ind w:firstLine="709"/>
-        <w:jc w:val="both"/>
-      </w:pPr>
-      <w:r>
-        <w:rPr>
-          <w:rFonts w:ascii="Times New Roman" w:hAnsi="Times New Roman"/>
-          <w:sz w:val="28"/>
-        </w:rPr>
-        <w:t>Для нормального функционирования программного продукта «CodePath» требуется:</w:t>
-      </w:r>
-    </w:p>
-    <w:p>
-      <w:pPr>
-        <w:ind w:left="709" w:firstLine="0"/>
-        <w:jc w:val="both"/>
-      </w:pPr>
-      <w:r>
-        <w:rPr>
-          <w:rFonts w:ascii="Times New Roman" w:hAnsi="Times New Roman"/>
-          <w:sz w:val="28"/>
-        </w:rPr>
-        <w:t>– персональный компьютер или мобильное устройство с доступом в Интернет;</w:t>
-      </w:r>
-    </w:p>
-    <w:p>
-      <w:pPr>
-        <w:ind w:left="709" w:firstLine="0"/>
-        <w:jc w:val="both"/>
-      </w:pPr>
-      <w:r>
-        <w:rPr>
-          <w:rFonts w:ascii="Times New Roman" w:hAnsi="Times New Roman"/>
-          <w:sz w:val="28"/>
-        </w:rPr>
-        <w:t>– современный веб-браузер (Google Chrome 90+, Mozilla Firefox 90+, Safari 14+, Microsoft Edge 90+), поддерживающий стандарты HTML5, CSS3, JavaScript ES2020+;</w:t>
-      </w:r>
-    </w:p>
-    <w:p>
-      <w:pPr>
-        <w:ind w:left="709" w:firstLine="0"/>
-        <w:jc w:val="both"/>
-      </w:pPr>
-      <w:r>
-        <w:rPr>
-          <w:rFonts w:ascii="Times New Roman" w:hAnsi="Times New Roman"/>
-          <w:sz w:val="28"/>
-        </w:rPr>
-        <w:t>– минимальное разрешение экрана: 375×667 пикселей (адаптивный дизайн обеспечивает корректное отображение на всех устройствах);</w:t>
-      </w:r>
-    </w:p>
-    <w:p>
-      <w:pPr>
-        <w:ind w:left="709" w:firstLine="0"/>
-        <w:jc w:val="both"/>
-      </w:pPr>
-      <w:r>
-        <w:rPr>
-          <w:rFonts w:ascii="Times New Roman" w:hAnsi="Times New Roman"/>
-          <w:sz w:val="28"/>
-        </w:rPr>
-        <w:t>– рекомендуемая скорость интернет-соединения: от 1 Мбит/с.</w:t>
-      </w:r>
-    </w:p>
-    <w:p>
-      <w:pPr>
-        <w:ind w:firstLine="709"/>
-        <w:jc w:val="both"/>
-      </w:pPr>
-      <w:r>
-        <w:rPr>
-          <w:rFonts w:ascii="Times New Roman" w:hAnsi="Times New Roman"/>
-          <w:sz w:val="28"/>
-        </w:rPr>
-        <w:t>Серверная часть требует:</w:t>
-      </w:r>
-    </w:p>
-    <w:p>
-      <w:pPr>
-        <w:ind w:left="709" w:firstLine="0"/>
-        <w:jc w:val="both"/>
-      </w:pPr>
-      <w:r>
-        <w:rPr>
-          <w:rFonts w:ascii="Times New Roman" w:hAnsi="Times New Roman"/>
-          <w:sz w:val="28"/>
-        </w:rPr>
-        <w:t>– среда выполнения Node.js версии 18+;</w:t>
-      </w:r>
-    </w:p>
-    <w:p>
-      <w:pPr>
-        <w:ind w:left="709" w:firstLine="0"/>
-        <w:jc w:val="both"/>
-      </w:pPr>
-      <w:r>
-        <w:rPr>
-          <w:rFonts w:ascii="Times New Roman" w:hAnsi="Times New Roman"/>
-          <w:sz w:val="28"/>
-        </w:rPr>
-        <w:t>– СУБД PostgreSQL версии 16+;</w:t>
-      </w:r>
-    </w:p>
-    <w:p>
-      <w:pPr>
-        <w:ind w:left="709" w:firstLine="0"/>
-        <w:jc w:val="both"/>
-      </w:pPr>
-      <w:r>
-        <w:rPr>
-          <w:rFonts w:ascii="Times New Roman" w:hAnsi="Times New Roman"/>
-          <w:sz w:val="28"/>
-        </w:rPr>
-        <w:t>– оперативная память: не менее 512 МБ;</w:t>
-      </w:r>
-    </w:p>
-    <w:p>
-      <w:pPr>
-        <w:ind w:left="709" w:firstLine="0"/>
-        <w:jc w:val="both"/>
-      </w:pPr>
-      <w:r>
-        <w:rPr>
-          <w:rFonts w:ascii="Times New Roman" w:hAnsi="Times New Roman"/>
-          <w:sz w:val="28"/>
-        </w:rPr>
-        <w:t>– наличие установленных интерпретаторов Python 3.11+ и Node.js для модуля выполнения кода.</w:t>
-      </w:r>
-    </w:p>
-    <w:p>
-      <w:pPr>
-        <w:spacing w:before="240" w:after="120"/>
-        <w:jc w:val="center"/>
-      </w:pPr>
-      <w:r>
-        <w:rPr>
-          <w:rFonts w:ascii="Times New Roman" w:hAnsi="Times New Roman"/>
-          <w:b/>
-          <w:sz w:val="28"/>
-        </w:rPr>
-        <w:t>2.1.4. Требования к информационной и программной совместимости</w:t>
-      </w:r>
-    </w:p>
-    <w:p>
-      <w:pPr>
-        <w:ind w:firstLine="709"/>
-        <w:jc w:val="both"/>
-      </w:pPr>
-      <w:r>
-        <w:rPr>
-          <w:rFonts w:ascii="Times New Roman" w:hAnsi="Times New Roman"/>
-          <w:sz w:val="28"/>
-        </w:rPr>
-        <w:t>Программный продукт «CodePath» разработан как веб-приложение и не требует установки дополнительного программного обеспечения на стороне клиента. Клиентская часть реализована как одностраничное приложение (SPA), работающее в любом современном веб-браузере. Серверная часть развёрнута на платформе Replit с использованием автомасштабируемого деплоя и взаимодействует с облачной базой данных PostgreSQL.</w:t>
-      </w:r>
-    </w:p>
-    <w:p>
-      <w:pPr>
-        <w:spacing w:before="240" w:after="120"/>
-        <w:jc w:val="center"/>
-      </w:pPr>
-      <w:r>
-        <w:rPr>
-          <w:rFonts w:ascii="Times New Roman" w:hAnsi="Times New Roman"/>
-          <w:b/>
-          <w:sz w:val="28"/>
-        </w:rPr>
-        <w:t>2.2. Описание программного продукта</w:t>
-      </w:r>
-    </w:p>
-    <w:p>
+      <w:bookmarkStart w:id="10" w:name="bm_221"/>
       <w:pPr>
         <w:spacing w:before="240" w:after="120"/>
         <w:jc w:val="center"/>
@@ -1505,6 +1895,7 @@
         </w:rPr>
         <w:t>2.2.1. Выбор среды программирования</w:t>
       </w:r>
+      <w:bookmarkEnd w:id="10"/>
     </w:p>
     <w:p>
       <w:pPr>
@@ -1516,7 +1907,7 @@
           <w:rFonts w:ascii="Times New Roman" w:hAnsi="Times New Roman"/>
           <w:sz w:val="28"/>
         </w:rPr>
-        <w:t>Для реализации клиентской части веб-приложения «CodePath» был выбран фреймворк React в связке со сборщиком Vite. React является одной из наиболее популярных и зрелых библиотек для построения пользовательских интерфейсов, обеспечивающей компонентную архитектуру, декларативный подход к описанию UI и высокую производительность благодаря виртуальному DOM. Vite используется как инструмент сборки, обеспечивающий мгновенную горячую перезагрузку модулей (HMR) и оптимизированную сборку для производственной среды.</w:t>
+        <w:t>Для реализации клиентской части веб-приложения «CodePath» был выбран фреймворк React в связке со сборщиком Vite. React является одной из наиболее популярных и зрелых библиотек для построения пользовательских интерфейсов. Vite используется как инструмент сборки, обеспечивающий мгновенную горячую перезагрузку модулей (HMR) и оптимизированную сборку для производственной среды.</w:t>
       </w:r>
     </w:p>
     <w:p>
@@ -1529,7 +1920,7 @@
           <w:rFonts w:ascii="Times New Roman" w:hAnsi="Times New Roman"/>
           <w:sz w:val="28"/>
         </w:rPr>
-        <w:t>Для стилизации интерфейса применяется Tailwind CSS — утилитарный CSS-фреймворк, позволяющий быстро создавать адаптивные и визуально привлекательные интерфейсы без написания отдельных файлов стилей. В качестве библиотеки UI-компонентов используются примитивы Radix UI, обеспечивающие доступность (WCAG-совместимость), а также Framer Motion для создания плавных анимаций переходов и интерактивных элементов.</w:t>
+        <w:t>Для стилизации интерфейса применяется Tailwind CSS. В качестве библиотеки UI-компонентов используются примитивы Radix UI, а также Framer Motion для создания плавных анимаций.</w:t>
       </w:r>
     </w:p>
     <w:p>
@@ -1555,7 +1946,7 @@
           <w:rFonts w:ascii="Times New Roman" w:hAnsi="Times New Roman"/>
           <w:sz w:val="28"/>
         </w:rPr>
-        <w:t>Управление состоянием и взаимодействие с серверным API реализовано через TanStack React Query, который обеспечивает эффективное кеширование данных, автоматическую повторную загрузку и синхронизацию состояния клиента с сервером. Маршрутизация реализована через легковесную библиотеку Wouter.</w:t>
+        <w:t>Управление состоянием и взаимодействие с серверным API реализовано через TanStack React Query. Маршрутизация реализована через легковесную библиотеку Wouter.</w:t>
       </w:r>
     </w:p>
     <w:p>
@@ -1568,7 +1959,7 @@
           <w:rFonts w:ascii="Times New Roman" w:hAnsi="Times New Roman"/>
           <w:sz w:val="28"/>
         </w:rPr>
-        <w:t>На серверной стороне используется Express (версия 5) — минималистичный и гибкий веб-фреймворк для Node.js, который обеспечивает обработку HTTP-запросов и маршрутизацию API. Весь серверный код написан на TypeScript, что обеспечивает строгую типизацию и раннее обнаружение ошибок на этапе разработки.</w:t>
+        <w:t>На серверной стороне используется Express (версия 5) — минималистичный и гибкий веб-фреймворк для Node.js. Весь серверный код написан на TypeScript.</w:t>
       </w:r>
     </w:p>
     <w:p>
@@ -1581,23 +1972,11 @@
           <w:rFonts w:ascii="Times New Roman" w:hAnsi="Times New Roman"/>
           <w:sz w:val="28"/>
         </w:rPr>
-        <w:t>Для аутентификации используется система JWT-токенов (JSON Web Tokens), обеспечивающая безопасную работу с сессиями без необходимости хранения состояния на сервере.</w:t>
+        <w:t>Для аутентификации используется система JWT-токенов (JSON Web Tokens). В качестве СУБД выбрана PostgreSQL, а доступ к данным реализован через Drizzle ORM.</w:t>
       </w:r>
     </w:p>
     <w:p>
-      <w:pPr>
-        <w:ind w:firstLine="709"/>
-        <w:jc w:val="both"/>
-      </w:pPr>
-      <w:r>
-        <w:rPr>
-          <w:rFonts w:ascii="Times New Roman" w:hAnsi="Times New Roman"/>
-          <w:sz w:val="28"/>
-        </w:rPr>
-        <w:t>В качестве СУБД выбрана PostgreSQL, а доступ к данным реализован через Drizzle ORM. Такой выбор позволяет хранить информацию в реляционном виде и при этом описывать структуру таблиц и связей в типизированном виде на стороне приложения, что удобно для сущностей «пользователь», «курс», «модуль», «урок», «квиз», «задача», «прогресс» и «достижение».</w:t>
-      </w:r>
-    </w:p>
-    <w:p>
+      <w:bookmarkStart w:id="11" w:name="bm_222"/>
       <w:pPr>
         <w:spacing w:before="240" w:after="120"/>
         <w:jc w:val="center"/>
@@ -1610,6 +1989,7 @@
         </w:rPr>
         <w:t>2.2.2. Структура информационной системы проекта</w:t>
       </w:r>
+      <w:bookmarkEnd w:id="11"/>
     </w:p>
     <w:p>
       <w:pPr>
@@ -1621,7 +2001,7 @@
           <w:rFonts w:ascii="Times New Roman" w:hAnsi="Times New Roman"/>
           <w:sz w:val="28"/>
         </w:rPr>
-        <w:t>Информационная система веб-приложения «CodePath» построена по типовой схеме веб-сервиса и включает пользовательскую часть, серверную часть и слой данных. Пользовательская часть представляет собой набор страниц и компонентов интерфейса, которые отображаются в браузере и обеспечивают выполнение действий пользователя, а серверная часть обрабатывает запросы, выполняет проверки доступа, обращается к базе данных, выполняет пользовательский код и возвращает результаты в виде ответов для интерфейса.</w:t>
+        <w:t>Информационная система веб-приложения «CodePath» построена по типовой схеме веб-сервиса и включает пользовательскую часть, серверную часть и слой данных.</w:t>
       </w:r>
     </w:p>
     <w:p>
@@ -1634,7 +2014,7 @@
           <w:rFonts w:ascii="Times New Roman" w:hAnsi="Times New Roman"/>
           <w:sz w:val="28"/>
         </w:rPr>
-        <w:t>Слой данных представлен реляционной базой PostgreSQL, где описаны основные сущности и связи проекта. В структуре предусмотрена таблица пользователей (users) с уникальным username, хранением хэша пароля, email и параметрами профиля. Образовательная часть включает таблицы курсов (courses) с метаданными, модулей (modules) для группировки уроков, уроков (lessons) трёх типов (теория, квиз, практика), вопросов квизов (quiz_questions) с вариантами ответов (quiz_options), практических заданий (coding_challenges) с тест-кейсами (test_cases). Геймификационная часть включает таблицы XP (user_xp), серий обучения (user_streaks), достижений (achievements) и полученных достижений пользователей (user_achievements). Прогресс отслеживается через таблицы user_lesson_progress и user_course_enrollments.</w:t>
+        <w:t>Слой данных представлен реляционной базой PostgreSQL. В структуре предусмотрена таблица пользователей (users), курсов (courses), модулей (modules), уроков (lessons), вопросов квизов (quiz_questions), вариантов ответов (quiz_options), практических заданий (coding_challenges), тест-кейсов (test_cases), XP (user_xp), серий обучения (user_streaks), достижений (achievements), полученных достижений (user_achievements), прогресса (user_lesson_progress) и записей на курсы (user_course_enrollments).</w:t>
       </w:r>
     </w:p>
     <w:p>
@@ -1647,20 +2027,7 @@
           <w:rFonts w:ascii="Times New Roman" w:hAnsi="Times New Roman"/>
           <w:sz w:val="28"/>
         </w:rPr>
-        <w:t>Серверная часть логически разделена по функциональным направлениям, что выражается в отдельных Express-роутерах, объединяемых под общим префиксом API. В системе выделяются операции аутентификации, операции работы с курсами, операции прохождения уроков, операции геймификации, а также административные операции (CRUD для всех сущностей контента).</w:t>
-      </w:r>
-    </w:p>
-    <w:p>
-      <w:pPr>
-        <w:ind w:firstLine="709"/>
-        <w:jc w:val="both"/>
-      </w:pPr>
-      <w:r>
-        <w:rPr>
-          <w:rFonts w:ascii="Times New Roman" w:hAnsi="Times New Roman"/>
-          <w:sz w:val="28"/>
-        </w:rPr>
-        <w:t>Отдельным элементом структуры является модуль выполнения пользовательского кода (CodeRunner). В проекте реализован серверный модуль, принимающий код пользователя и набор тест-кейсов, запускающий код через дочерние процессы для Python и JavaScript, а также выполняющий проверку HTML, CSS и SQL через сопоставление с образцом.</w:t>
+        <w:t>Серверная часть логически разделена по функциональным направлениям в отдельных Express-роутерах. Отдельным элементом структуры является модуль выполнения пользовательского кода (CodeRunner).</w:t>
       </w:r>
     </w:p>
     <w:p>
@@ -1669,6 +2036,7 @@
       </w:r>
     </w:p>
     <w:p>
+      <w:bookmarkStart w:id="12" w:name="bm_r3"/>
       <w:pPr>
         <w:spacing w:before="240" w:after="120"/>
         <w:jc w:val="center"/>
@@ -1681,8 +2049,10 @@
         </w:rPr>
         <w:t>Раздел 3. Организация работ по внедрению программного продукта</w:t>
       </w:r>
+      <w:bookmarkEnd w:id="12"/>
     </w:p>
     <w:p>
+      <w:bookmarkStart w:id="13" w:name="bm_31"/>
       <w:pPr>
         <w:spacing w:before="240" w:after="120"/>
         <w:jc w:val="center"/>
@@ -1695,6 +2065,7 @@
         </w:rPr>
         <w:t>3.1. Установка и настройка компонентов программного продукта</w:t>
       </w:r>
+      <w:bookmarkEnd w:id="13"/>
     </w:p>
     <w:p>
       <w:r>
@@ -1705,6 +2076,7 @@
       </w:r>
     </w:p>
     <w:p>
+      <w:bookmarkStart w:id="14" w:name="bm_32"/>
       <w:pPr>
         <w:spacing w:before="240" w:after="120"/>
         <w:jc w:val="center"/>
@@ -1717,6 +2089,7 @@
         </w:rPr>
         <w:t>3.2. Тестирование компонентов программного продукта</w:t>
       </w:r>
+      <w:bookmarkEnd w:id="14"/>
     </w:p>
     <w:p>
       <w:r>
@@ -1727,6 +2100,7 @@
       </w:r>
     </w:p>
     <w:p>
+      <w:bookmarkStart w:id="15" w:name="bm_33"/>
       <w:pPr>
         <w:spacing w:before="240" w:after="120"/>
         <w:jc w:val="center"/>
@@ -1739,6 +2113,7 @@
         </w:rPr>
         <w:t>3.3. Расчет технико-экономических показателей</w:t>
       </w:r>
+      <w:bookmarkEnd w:id="15"/>
     </w:p>
     <w:p>
       <w:pPr>
@@ -1894,7 +2269,7 @@
           <w:rFonts w:ascii="Times New Roman" w:hAnsi="Times New Roman"/>
           <w:sz w:val="28"/>
         </w:rPr>
-        <w:t>Для подсчета себестоимости проекта и экономической эффективности данного программного продукта, нужны следующие составляющие:</w:t>
+        <w:t>Для подсчета себестоимости проекта нужны следующие составляющие:</w:t>
       </w:r>
     </w:p>
     <w:p>
@@ -2046,7 +2421,7 @@
                 <w:b/>
                 <w:sz w:val="24"/>
               </w:rPr>
-              <w:t>Единицы измерения</w:t>
+              <w:t>Ед. изм.</w:t>
             </w:r>
           </w:p>
         </w:tc>
@@ -2083,7 +2458,7 @@
                 <w:rFonts w:ascii="Times New Roman" w:hAnsi="Times New Roman"/>
                 <w:sz w:val="24"/>
               </w:rPr>
-              <w:t>Страховые взносы (от заработной платы), в том числе:</w:t>
+              <w:t>Страховые взносы (от ЗП), в т.ч.:</w:t>
             </w:r>
           </w:p>
         </w:tc>
@@ -2136,7 +2511,7 @@
                 <w:rFonts w:ascii="Times New Roman" w:hAnsi="Times New Roman"/>
                 <w:sz w:val="24"/>
               </w:rPr>
-              <w:t>- отчисления в пенсионный фонд</w:t>
+              <w:t>- отчисления в ПФ</w:t>
             </w:r>
           </w:p>
         </w:tc>
@@ -2189,7 +2564,7 @@
                 <w:rFonts w:ascii="Times New Roman" w:hAnsi="Times New Roman"/>
                 <w:sz w:val="24"/>
               </w:rPr>
-              <w:t>- отчисления в фонд социального страхования</w:t>
+              <w:t>- отчисления в ФСС</w:t>
             </w:r>
           </w:p>
         </w:tc>
@@ -2242,7 +2617,7 @@
                 <w:rFonts w:ascii="Times New Roman" w:hAnsi="Times New Roman"/>
                 <w:sz w:val="24"/>
               </w:rPr>
-              <w:t>- отчисления в Федеральный и Территориальный фонд обязательного медицинского страхования</w:t>
+              <w:t>- отчисления в ФФОМС и ТФОМС</w:t>
             </w:r>
           </w:p>
         </w:tc>
@@ -2295,7 +2670,7 @@
                 <w:rFonts w:ascii="Times New Roman" w:hAnsi="Times New Roman"/>
                 <w:sz w:val="24"/>
               </w:rPr>
-              <w:t>Заработная плата специалиста (разработчик Интернет-сайта)</w:t>
+              <w:t>ЗП специалиста (разработчик)</w:t>
             </w:r>
           </w:p>
         </w:tc>
@@ -2401,7 +2776,7 @@
                 <w:rFonts w:ascii="Times New Roman" w:hAnsi="Times New Roman"/>
                 <w:sz w:val="24"/>
               </w:rPr>
-              <w:t>Заработная плата специалиста (администратор)</w:t>
+              <w:t>ЗП специалиста (администратор)</w:t>
             </w:r>
           </w:p>
         </w:tc>
@@ -2507,7 +2882,7 @@
                 <w:rFonts w:ascii="Times New Roman" w:hAnsi="Times New Roman"/>
                 <w:sz w:val="24"/>
               </w:rPr>
-              <w:t>Фонд рабочего времени в 2026 году</w:t>
+              <w:t>Фонд рабочего времени в 2026 г.</w:t>
             </w:r>
           </w:p>
         </w:tc>
@@ -2666,7 +3041,7 @@
                 <w:rFonts w:ascii="Times New Roman" w:hAnsi="Times New Roman"/>
                 <w:sz w:val="24"/>
               </w:rPr>
-              <w:t>Срок полезного использования компьютера</w:t>
+              <w:t>Срок полезного использования ПК</w:t>
             </w:r>
           </w:p>
         </w:tc>
@@ -2719,7 +3094,7 @@
                 <w:rFonts w:ascii="Times New Roman" w:hAnsi="Times New Roman"/>
                 <w:sz w:val="24"/>
               </w:rPr>
-              <w:t>Затраты на текущий и профилактический ремонт компьютера (от стоимости компьютера) в год</w:t>
+              <w:t>Затраты на ремонт ПК (от стоимости) в год</w:t>
             </w:r>
           </w:p>
         </w:tc>
@@ -2772,7 +3147,7 @@
                 <w:rFonts w:ascii="Times New Roman" w:hAnsi="Times New Roman"/>
                 <w:sz w:val="24"/>
               </w:rPr>
-              <w:t>Затраты на материалы, необходимые для эксплуатации компьютера (от стоимости компьютера) в год</w:t>
+              <w:t>Затраты на материалы для ПК в год</w:t>
             </w:r>
           </w:p>
         </w:tc>
@@ -2825,7 +3200,7 @@
                 <w:rFonts w:ascii="Times New Roman" w:hAnsi="Times New Roman"/>
                 <w:sz w:val="24"/>
               </w:rPr>
-              <w:t>Потребляемая мощность компьютера</w:t>
+              <w:t>Потребляемая мощность ПК</w:t>
             </w:r>
           </w:p>
         </w:tc>
@@ -2895,7 +3270,7 @@
                 <w:rFonts w:ascii="Times New Roman" w:hAnsi="Times New Roman"/>
                 <w:sz w:val="24"/>
               </w:rPr>
-              <w:t>Руб./кВт-час.</w:t>
+              <w:t>Руб./кВт-ч.</w:t>
             </w:r>
           </w:p>
         </w:tc>
@@ -3147,20 +3522,7 @@
           <w:rFonts w:ascii="Times New Roman" w:hAnsi="Times New Roman"/>
           <w:sz w:val="28"/>
         </w:rPr>
-        <w:t xml:space="preserve">    Кп – процент премии;</w:t>
-      </w:r>
-    </w:p>
-    <w:p>
-      <w:pPr>
-        <w:ind w:firstLine="709"/>
-        <w:jc w:val="both"/>
-      </w:pPr>
-      <w:r>
-        <w:rPr>
-          <w:rFonts w:ascii="Times New Roman" w:hAnsi="Times New Roman"/>
-          <w:sz w:val="28"/>
-        </w:rPr>
-        <w:t xml:space="preserve">    Фрв – фонд рабочего времени в год.</w:t>
+        <w:t xml:space="preserve">    Кп – процент премии; Фрв – фонд рабочего времени в год.</w:t>
       </w:r>
     </w:p>
     <w:p>
@@ -3186,20 +3548,7 @@
           <w:rFonts w:ascii="Times New Roman" w:hAnsi="Times New Roman"/>
           <w:sz w:val="28"/>
         </w:rPr>
-        <w:t>Для администратора:</w:t>
-      </w:r>
-    </w:p>
-    <w:p>
-      <w:pPr>
-        <w:ind w:firstLine="709"/>
-        <w:jc w:val="both"/>
-      </w:pPr>
-      <w:r>
-        <w:rPr>
-          <w:rFonts w:ascii="Times New Roman" w:hAnsi="Times New Roman"/>
-          <w:sz w:val="28"/>
-        </w:rPr>
-        <w:t>ЗПср.час. = 70 000 *1,2 * 12 / 1972 = 511,16 руб./час</w:t>
+        <w:t>Для администратора: ЗПср.час. = 70 000 *1,2 * 12 / 1972 = 511,16 руб./час</w:t>
       </w:r>
     </w:p>
     <w:p>
@@ -3237,7 +3586,7 @@
           <w:rFonts w:ascii="Times New Roman" w:hAnsi="Times New Roman"/>
           <w:sz w:val="28"/>
         </w:rPr>
-        <w:t>где: ЗП - это размер затрат на оплату труда привлекаемых специалистов;</w:t>
+        <w:t>ЗП = 851,93 * 240 = 204462,47 руб.</w:t>
       </w:r>
     </w:p>
     <w:p>
@@ -3250,59 +3599,7 @@
           <w:rFonts w:ascii="Times New Roman" w:hAnsi="Times New Roman"/>
           <w:sz w:val="28"/>
         </w:rPr>
-        <w:t xml:space="preserve">    Тпр – трудоемкость разработки программного продукта, час.;</w:t>
-      </w:r>
-    </w:p>
-    <w:p>
-      <w:pPr>
-        <w:ind w:firstLine="709"/>
-        <w:jc w:val="both"/>
-      </w:pPr>
-      <w:r>
-        <w:rPr>
-          <w:rFonts w:ascii="Times New Roman" w:hAnsi="Times New Roman"/>
-          <w:sz w:val="28"/>
-        </w:rPr>
-        <w:t xml:space="preserve">    ЗПср.час – среднечасовая оплата труда, руб./час.;</w:t>
-      </w:r>
-    </w:p>
-    <w:p>
-      <w:pPr>
-        <w:ind w:firstLine="709"/>
-        <w:jc w:val="both"/>
-      </w:pPr>
-      <w:r>
-        <w:rPr>
-          <w:rFonts w:ascii="Times New Roman" w:hAnsi="Times New Roman"/>
-          <w:sz w:val="28"/>
-        </w:rPr>
-        <w:t>ЗП = 851,93 * 240 = 204462,47 руб.</w:t>
-      </w:r>
-    </w:p>
-    <w:p>
-      <w:pPr>
-        <w:ind w:firstLine="709"/>
-        <w:jc w:val="both"/>
-      </w:pPr>
-      <w:r>
-        <w:rPr>
-          <w:rFonts w:ascii="Times New Roman" w:hAnsi="Times New Roman"/>
-          <w:sz w:val="28"/>
-        </w:rPr>
-        <w:t>Для администратора</w:t>
-      </w:r>
-    </w:p>
-    <w:p>
-      <w:pPr>
-        <w:ind w:firstLine="709"/>
-        <w:jc w:val="both"/>
-      </w:pPr>
-      <w:r>
-        <w:rPr>
-          <w:rFonts w:ascii="Times New Roman" w:hAnsi="Times New Roman"/>
-          <w:sz w:val="28"/>
-        </w:rPr>
-        <w:t>ЗП = 511,16 × 140 = 71561,87 руб.</w:t>
+        <w:t>Для администратора: ЗП = 511,16 × 140 = 71561,87 руб.</w:t>
       </w:r>
     </w:p>
     <w:p>
@@ -3321,19 +3618,6 @@
     </w:p>
     <w:p>
       <w:pPr>
-        <w:ind w:firstLine="709"/>
-        <w:jc w:val="both"/>
-      </w:pPr>
-      <w:r>
-        <w:rPr>
-          <w:rFonts w:ascii="Times New Roman" w:hAnsi="Times New Roman"/>
-          <w:sz w:val="28"/>
-        </w:rPr>
-        <w:t>Расчет страховых взносов принимается в размере 30% от заработной платы (3)</w:t>
-      </w:r>
-    </w:p>
-    <w:p>
-      <w:pPr>
         <w:jc w:val="right"/>
       </w:pPr>
       <w:r>
@@ -3354,7 +3638,7 @@
           <w:rFonts w:ascii="Times New Roman" w:hAnsi="Times New Roman"/>
           <w:sz w:val="28"/>
         </w:rPr>
-        <w:t>СтрВзн = (204462,47+71561,87) * 0,3=82807,30 руб.</w:t>
+        <w:t>СтрВзн = (204462,47+71561,87) * 0,3 = 82807,30 руб.</w:t>
       </w:r>
     </w:p>
     <w:p>
@@ -3373,15 +3657,14 @@
     </w:p>
     <w:p>
       <w:pPr>
-        <w:ind w:firstLine="709"/>
-        <w:jc w:val="both"/>
+        <w:jc w:val="right"/>
       </w:pPr>
       <w:r>
         <w:rPr>
           <w:rFonts w:ascii="Times New Roman" w:hAnsi="Times New Roman"/>
           <w:sz w:val="28"/>
         </w:rPr>
-        <w:t>Амортизационные отчисления – отчисления части стоимости основных фондов для возмещения их износа. Амортизационные отчисления включаются в издержки производства и рассчитываются по формуле (4):</w:t>
+        <w:t>АО = Сп * На * Тмаш / Фрв                        (4)</w:t>
       </w:r>
     </w:p>
     <w:p>
@@ -3393,7 +3676,7 @@
           <w:rFonts w:ascii="Times New Roman" w:hAnsi="Times New Roman"/>
           <w:sz w:val="28"/>
         </w:rPr>
-        <w:t>АО = Сп *На * Тмаш / Фрв,                        (4)</w:t>
+        <w:t>На = 1 / СПИ * 100%                               (5)</w:t>
       </w:r>
     </w:p>
     <w:p>
@@ -3406,97 +3689,7 @@
           <w:rFonts w:ascii="Times New Roman" w:hAnsi="Times New Roman"/>
           <w:sz w:val="28"/>
         </w:rPr>
-        <w:t>где Сп – стоимость компьютера, руб.</w:t>
-      </w:r>
-    </w:p>
-    <w:p>
-      <w:pPr>
-        <w:ind w:firstLine="709"/>
-        <w:jc w:val="both"/>
-      </w:pPr>
-      <w:r>
-        <w:rPr>
-          <w:rFonts w:ascii="Times New Roman" w:hAnsi="Times New Roman"/>
-          <w:sz w:val="28"/>
-        </w:rPr>
-        <w:t xml:space="preserve">   На – норма амортизационных отчислений за год, % рассчитывается по формуле (5):</w:t>
-      </w:r>
-    </w:p>
-    <w:p>
-      <w:pPr>
-        <w:jc w:val="right"/>
-      </w:pPr>
-      <w:r>
-        <w:rPr>
-          <w:rFonts w:ascii="Times New Roman" w:hAnsi="Times New Roman"/>
-          <w:sz w:val="28"/>
-        </w:rPr>
-        <w:t>На = 1 / СПИ * 100%,                              (5)</w:t>
-      </w:r>
-    </w:p>
-    <w:p>
-      <w:pPr>
-        <w:ind w:firstLine="709"/>
-        <w:jc w:val="both"/>
-      </w:pPr>
-      <w:r>
-        <w:rPr>
-          <w:rFonts w:ascii="Times New Roman" w:hAnsi="Times New Roman"/>
-          <w:sz w:val="28"/>
-        </w:rPr>
-        <w:t>где СПИ – срок полезного использования компьютера, лет;</w:t>
-      </w:r>
-    </w:p>
-    <w:p>
-      <w:pPr>
-        <w:ind w:firstLine="709"/>
-        <w:jc w:val="both"/>
-      </w:pPr>
-      <w:r>
-        <w:rPr>
-          <w:rFonts w:ascii="Times New Roman" w:hAnsi="Times New Roman"/>
-          <w:sz w:val="28"/>
-        </w:rPr>
-        <w:t xml:space="preserve">   Тмаш – машинное время, час;</w:t>
-      </w:r>
-    </w:p>
-    <w:p>
-      <w:pPr>
-        <w:ind w:firstLine="709"/>
-        <w:jc w:val="both"/>
-      </w:pPr>
-      <w:r>
-        <w:rPr>
-          <w:rFonts w:ascii="Times New Roman" w:hAnsi="Times New Roman"/>
-          <w:sz w:val="28"/>
-        </w:rPr>
-        <w:t xml:space="preserve">   Фрв – фонд рабочего времени в год.</w:t>
-      </w:r>
-    </w:p>
-    <w:p>
-      <w:pPr>
-        <w:ind w:firstLine="709"/>
-        <w:jc w:val="both"/>
-      </w:pPr>
-      <w:r>
-        <w:rPr>
-          <w:rFonts w:ascii="Times New Roman" w:hAnsi="Times New Roman"/>
-          <w:sz w:val="28"/>
-        </w:rPr>
-        <w:t>На = 1 / 5 *100 =20%</w:t>
-      </w:r>
-    </w:p>
-    <w:p>
-      <w:pPr>
-        <w:ind w:firstLine="709"/>
-        <w:jc w:val="both"/>
-      </w:pPr>
-      <w:r>
-        <w:rPr>
-          <w:rFonts w:ascii="Times New Roman" w:hAnsi="Times New Roman"/>
-          <w:sz w:val="28"/>
-        </w:rPr>
-        <w:t>АО = 100 000 * 0,2 * 380 / 1972 = 3 853,96 руб.</w:t>
+        <w:t>На = 1/5*100 = 20%; АО = 100000*0,2*380/1972 = 3853,96 руб.</w:t>
       </w:r>
     </w:p>
     <w:p>
@@ -3510,20 +3703,7 @@
           <w:b w:val="0"/>
           <w:sz w:val="28"/>
         </w:rPr>
-        <w:t>Затраты на текущий и профилактический ремонт компьютера</w:t>
-      </w:r>
-    </w:p>
-    <w:p>
-      <w:pPr>
-        <w:ind w:firstLine="709"/>
-        <w:jc w:val="both"/>
-      </w:pPr>
-      <w:r>
-        <w:rPr>
-          <w:rFonts w:ascii="Times New Roman" w:hAnsi="Times New Roman"/>
-          <w:sz w:val="28"/>
-        </w:rPr>
-        <w:t>Затраты на текущий и профилактический ремонт компьютера рассчитывается по формуле (6):</w:t>
+        <w:t>Затраты на ремонт</w:t>
       </w:r>
     </w:p>
     <w:p>
@@ -3548,7 +3728,7 @@
           <w:rFonts w:ascii="Times New Roman" w:hAnsi="Times New Roman"/>
           <w:sz w:val="28"/>
         </w:rPr>
-        <w:t>Зпр.р. =100 000 * 0,06 * 380/1972 = 1156,19 руб.</w:t>
+        <w:t>Зпр.р. = 100000*0,06*380/1972 = 1156,19 руб.</w:t>
       </w:r>
     </w:p>
     <w:p>
@@ -3562,20 +3742,7 @@
           <w:b w:val="0"/>
           <w:sz w:val="28"/>
         </w:rPr>
-        <w:t>Затраты на материалы, необходимые для эксплуатации компьютера</w:t>
-      </w:r>
-    </w:p>
-    <w:p>
-      <w:pPr>
-        <w:ind w:firstLine="709"/>
-        <w:jc w:val="both"/>
-      </w:pPr>
-      <w:r>
-        <w:rPr>
-          <w:rFonts w:ascii="Times New Roman" w:hAnsi="Times New Roman"/>
-          <w:sz w:val="28"/>
-        </w:rPr>
-        <w:t>Затраты на материалы рассчитывается по формуле (7):</w:t>
+        <w:t>Затраты на материалы</w:t>
       </w:r>
     </w:p>
     <w:p>
@@ -3600,7 +3767,7 @@
           <w:rFonts w:ascii="Times New Roman" w:hAnsi="Times New Roman"/>
           <w:sz w:val="28"/>
         </w:rPr>
-        <w:t>Зматер. = 100 000 * 0,02 * 380/1972 = 385,40 руб.</w:t>
+        <w:t>Зматер. = 100000*0,02*380/1972 = 385,40 руб.</w:t>
       </w:r>
     </w:p>
     <w:p>
@@ -3619,66 +3786,27 @@
     </w:p>
     <w:p>
       <w:pPr>
-        <w:ind w:firstLine="709"/>
-        <w:jc w:val="both"/>
+        <w:jc w:val="right"/>
       </w:pPr>
       <w:r>
         <w:rPr>
           <w:rFonts w:ascii="Times New Roman" w:hAnsi="Times New Roman"/>
           <w:sz w:val="28"/>
         </w:rPr>
-        <w:t>Затраты на электроэнергию рассчитывается по формуле (8):</w:t>
+        <w:t>Зэл. = W * Сэл. * Тмаш                            (8)</w:t>
       </w:r>
     </w:p>
     <w:p>
       <w:pPr>
-        <w:jc w:val="right"/>
+        <w:ind w:firstLine="709"/>
+        <w:jc w:val="both"/>
       </w:pPr>
       <w:r>
         <w:rPr>
           <w:rFonts w:ascii="Times New Roman" w:hAnsi="Times New Roman"/>
           <w:sz w:val="28"/>
         </w:rPr>
-        <w:t>Зэл. = W * Сэл. * Тмаш ,                          (8)</w:t>
-      </w:r>
-    </w:p>
-    <w:p>
-      <w:pPr>
-        <w:ind w:firstLine="709"/>
-        <w:jc w:val="both"/>
-      </w:pPr>
-      <w:r>
-        <w:rPr>
-          <w:rFonts w:ascii="Times New Roman" w:hAnsi="Times New Roman"/>
-          <w:sz w:val="28"/>
-        </w:rPr>
-        <w:t>где W – потребляемая мощность компьютера, кВт;</w:t>
-      </w:r>
-    </w:p>
-    <w:p>
-      <w:pPr>
-        <w:ind w:firstLine="709"/>
-        <w:jc w:val="both"/>
-      </w:pPr>
-      <w:r>
-        <w:rPr>
-          <w:rFonts w:ascii="Times New Roman" w:hAnsi="Times New Roman"/>
-          <w:sz w:val="28"/>
-        </w:rPr>
-        <w:t>Сэл. – тариф на электроэнергию, руб/кВт-час.</w:t>
-      </w:r>
-    </w:p>
-    <w:p>
-      <w:pPr>
-        <w:ind w:firstLine="709"/>
-        <w:jc w:val="both"/>
-      </w:pPr>
-      <w:r>
-        <w:rPr>
-          <w:rFonts w:ascii="Times New Roman" w:hAnsi="Times New Roman"/>
-          <w:sz w:val="28"/>
-        </w:rPr>
-        <w:t>Зэл. = 0,45 * 7,87 * 380 = 1 345,77 руб</w:t>
+        <w:t>Зэл. = 0,45*7,87*380 = 1345,77 руб.</w:t>
       </w:r>
     </w:p>
     <w:p>
@@ -4160,19 +4288,6 @@
           <w:rFonts w:ascii="Times New Roman" w:hAnsi="Times New Roman"/>
           <w:sz w:val="28"/>
         </w:rPr>
-        <w:t>Полученные результаты расчета себестоимости программного продукта представлены на диаграмме «Статьи расхода предприятия» (см. рисунок 3).</w:t>
-      </w:r>
-    </w:p>
-    <w:p>
-      <w:pPr>
-        <w:ind w:firstLine="709"/>
-        <w:jc w:val="both"/>
-      </w:pPr>
-      <w:r>
-        <w:rPr>
-          <w:rFonts w:ascii="Times New Roman" w:hAnsi="Times New Roman"/>
-          <w:sz w:val="28"/>
-        </w:rPr>
         <w:t>[pic]</w:t>
       </w:r>
     </w:p>
@@ -4200,7 +4315,7 @@
           <w:b/>
           <w:sz w:val="28"/>
         </w:rPr>
-        <w:t>3.3.2. Сводные экономические показатели и выводы по проделанной работе</w:t>
+        <w:t>3.3.2. Сводные экономические показатели</w:t>
       </w:r>
     </w:p>
     <w:p>
@@ -4213,7 +4328,7 @@
           <w:rFonts w:ascii="Times New Roman" w:hAnsi="Times New Roman"/>
           <w:sz w:val="28"/>
         </w:rPr>
-        <w:t>Для расчета экономического эффекта получаемого за счёт увеличения числа обучающихся по формуле (9) необходимы следующие данные:</w:t>
+        <w:t>Для расчета экономического эффекта по формуле (9):</w:t>
       </w:r>
     </w:p>
     <w:p>
@@ -4226,58 +4341,19 @@
           <w:rFonts w:ascii="Times New Roman" w:hAnsi="Times New Roman"/>
           <w:sz w:val="28"/>
         </w:rPr>
-        <w:t>Q1 – фактическое количество обучающихся;</w:t>
+        <w:t>Q1 – фактическое количество обучающихся; Q2 - предполагаемый рост, %; A – средний доход; E – дополнительные обучающиеся.</w:t>
       </w:r>
     </w:p>
     <w:p>
       <w:pPr>
-        <w:ind w:firstLine="709"/>
-        <w:jc w:val="both"/>
+        <w:jc w:val="right"/>
       </w:pPr>
       <w:r>
         <w:rPr>
           <w:rFonts w:ascii="Times New Roman" w:hAnsi="Times New Roman"/>
           <w:sz w:val="28"/>
         </w:rPr>
-        <w:t>Q2 - предполагаемый рост количества обучающихся, %;</w:t>
-      </w:r>
-    </w:p>
-    <w:p>
-      <w:pPr>
-        <w:ind w:firstLine="709"/>
-        <w:jc w:val="both"/>
-      </w:pPr>
-      <w:r>
-        <w:rPr>
-          <w:rFonts w:ascii="Times New Roman" w:hAnsi="Times New Roman"/>
-          <w:sz w:val="28"/>
-        </w:rPr>
-        <w:t>A – средний доход с одного обучающегося;</w:t>
-      </w:r>
-    </w:p>
-    <w:p>
-      <w:pPr>
-        <w:ind w:firstLine="709"/>
-        <w:jc w:val="both"/>
-      </w:pPr>
-      <w:r>
-        <w:rPr>
-          <w:rFonts w:ascii="Times New Roman" w:hAnsi="Times New Roman"/>
-          <w:sz w:val="28"/>
-        </w:rPr>
-        <w:t>E – дополнительные обучающиеся.</w:t>
-      </w:r>
-    </w:p>
-    <w:p>
-      <w:pPr>
-        <w:jc w:val="right"/>
-      </w:pPr>
-      <w:r>
-        <w:rPr>
-          <w:rFonts w:ascii="Times New Roman" w:hAnsi="Times New Roman"/>
-          <w:sz w:val="28"/>
-        </w:rPr>
-        <w:t>Е= Q1*Q2                                          (9)</w:t>
+        <w:t>Е = Q1*Q2                                          (9)</w:t>
       </w:r>
     </w:p>
     <w:p>
@@ -4295,19 +4371,6 @@
     </w:p>
     <w:p>
       <w:pPr>
-        <w:ind w:firstLine="709"/>
-        <w:jc w:val="both"/>
-      </w:pPr>
-      <w:r>
-        <w:rPr>
-          <w:rFonts w:ascii="Times New Roman" w:hAnsi="Times New Roman"/>
-          <w:sz w:val="28"/>
-        </w:rPr>
-        <w:t>Для расчета дополнительного дохода (AI) используется формула (10):</w:t>
-      </w:r>
-    </w:p>
-    <w:p>
-      <w:pPr>
         <w:jc w:val="right"/>
       </w:pPr>
       <w:r>
@@ -4333,19 +4396,6 @@
     </w:p>
     <w:p>
       <w:pPr>
-        <w:ind w:firstLine="709"/>
-        <w:jc w:val="both"/>
-      </w:pPr>
-      <w:r>
-        <w:rPr>
-          <w:rFonts w:ascii="Times New Roman" w:hAnsi="Times New Roman"/>
-          <w:sz w:val="28"/>
-        </w:rPr>
-        <w:t>Расчет времени, за которое окупится программный продукт (11):</w:t>
-      </w:r>
-    </w:p>
-    <w:p>
-      <w:pPr>
         <w:jc w:val="right"/>
       </w:pPr>
       <w:r>
@@ -4370,37 +4420,12 @@
       </w:r>
     </w:p>
     <w:p>
-      <w:pPr>
-        <w:ind w:firstLine="709"/>
-        <w:jc w:val="both"/>
-      </w:pPr>
-      <w:r>
-        <w:rPr>
-          <w:rFonts w:ascii="Times New Roman" w:hAnsi="Times New Roman"/>
-          <w:sz w:val="28"/>
-        </w:rPr>
-        <w:t>Зитог - общая сумма денежных средств, потраченных на его разработку, внедрение и адаптацию составляет ххх.</w:t>
-      </w:r>
-    </w:p>
-    <w:p>
-      <w:pPr>
-        <w:ind w:firstLine="709"/>
-        <w:jc w:val="both"/>
-      </w:pPr>
-      <w:r>
-        <w:rPr>
-          <w:rFonts w:ascii="Times New Roman" w:hAnsi="Times New Roman"/>
-          <w:sz w:val="28"/>
-        </w:rPr>
-        <w:t>AI - ожидаемый экономический эффект от внедрения Интернет-сайта продукта равно ххх и время, за которое окупится программный продукт Ток период.</w:t>
-      </w:r>
-    </w:p>
-    <w:p>
       <w:r>
         <w:br w:type="page"/>
       </w:r>
     </w:p>
     <w:p>
+      <w:bookmarkStart w:id="16" w:name="bm_conclusion"/>
       <w:pPr>
         <w:spacing w:before="240" w:after="120"/>
         <w:jc w:val="center"/>
@@ -4413,6 +4438,7 @@
         </w:rPr>
         <w:t>Заключение</w:t>
       </w:r>
+      <w:bookmarkEnd w:id="16"/>
     </w:p>
     <w:p>
       <w:pPr>
@@ -4446,6 +4472,7 @@
       </w:r>
     </w:p>
     <w:p>
+      <w:bookmarkStart w:id="17" w:name="bm_lit"/>
       <w:pPr>
         <w:spacing w:before="240" w:after="120"/>
         <w:jc w:val="center"/>
@@ -4458,10 +4485,11 @@
         </w:rPr>
         <w:t>Список используемой литературы</w:t>
       </w:r>
+      <w:bookmarkEnd w:id="17"/>
     </w:p>
     <w:p>
       <w:pPr>
-        <w:ind w:left="567" w:firstLine="0"/>
+        <w:ind w:left="567"/>
       </w:pPr>
       <w:r>
         <w:rPr>
@@ -4473,7 +4501,7 @@
     </w:p>
     <w:p>
       <w:pPr>
-        <w:ind w:left="567" w:firstLine="0"/>
+        <w:ind w:left="567"/>
       </w:pPr>
       <w:r>
         <w:rPr>
@@ -4485,19 +4513,19 @@
     </w:p>
     <w:p>
       <w:pPr>
-        <w:ind w:left="567" w:firstLine="0"/>
+        <w:ind w:left="567"/>
       </w:pPr>
       <w:r>
         <w:rPr>
           <w:rFonts w:ascii="Times New Roman" w:hAnsi="Times New Roman"/>
           <w:sz w:val="28"/>
         </w:rPr>
-        <w:t>3. ГОСТ 19.106-79. Единая система программной документации. Программа и методика испытаний. Требования к содержанию и оформлению.</w:t>
+        <w:t>3. ГОСТ 19.106-79. Единая система программной документации.</w:t>
       </w:r>
     </w:p>
     <w:p>
       <w:pPr>
-        <w:ind w:left="567" w:firstLine="0"/>
+        <w:ind w:left="567"/>
       </w:pPr>
       <w:r>
         <w:rPr>
@@ -4509,19 +4537,19 @@
     </w:p>
     <w:p>
       <w:pPr>
-        <w:ind w:left="567" w:firstLine="0"/>
+        <w:ind w:left="567"/>
       </w:pPr>
       <w:r>
         <w:rPr>
           <w:rFonts w:ascii="Times New Roman" w:hAnsi="Times New Roman"/>
           <w:sz w:val="28"/>
         </w:rPr>
-        <w:t>5. ГОСТ 19.701-90 ЕСПД. Схемы алгоритмов, программ, данных и систем. Условные обозначения и правила выполнения.</w:t>
+        <w:t>5. ГОСТ 19.701-90 ЕСПД. Схемы алгоритмов, программ, данных и систем.</w:t>
       </w:r>
     </w:p>
     <w:p>
       <w:pPr>
-        <w:ind w:left="567" w:firstLine="0"/>
+        <w:ind w:left="567"/>
       </w:pPr>
       <w:r>
         <w:rPr>
@@ -4533,123 +4561,123 @@
     </w:p>
     <w:p>
       <w:pPr>
-        <w:ind w:left="567" w:firstLine="0"/>
+        <w:ind w:left="567"/>
       </w:pPr>
       <w:r>
         <w:rPr>
           <w:rFonts w:ascii="Times New Roman" w:hAnsi="Times New Roman"/>
           <w:sz w:val="28"/>
         </w:rPr>
-        <w:t>7. Коваль Т.Б. Методические рекомендации выполнения и защиты дипломного проекта для студентов специальности 09.02.07 Информационные системы и программирование. Учебное электронное пособие / Т.Б. Коваль – г. Москва: частное профессиональное образовательное учреждение «Московский городской открытый колледж», 2025. – 25 с.</w:t>
+        <w:t>7. Коваль Т.Б. Методические рекомендации выполнения и защиты дипломного проекта – г. Москва: МГОК, 2025. – 25 с.</w:t>
       </w:r>
     </w:p>
     <w:p>
       <w:pPr>
-        <w:ind w:left="567" w:firstLine="0"/>
+        <w:ind w:left="567"/>
       </w:pPr>
       <w:r>
         <w:rPr>
           <w:rFonts w:ascii="Times New Roman" w:hAnsi="Times New Roman"/>
           <w:sz w:val="28"/>
         </w:rPr>
-        <w:t>8. React – The library for web and native user interfaces [Электронный ресурс]. – Режим доступа: https://react.dev/</w:t>
+        <w:t>8. React – The library for web and native user interfaces [Электронный ресурс]. – https://react.dev/</w:t>
       </w:r>
     </w:p>
     <w:p>
       <w:pPr>
-        <w:ind w:left="567" w:firstLine="0"/>
+        <w:ind w:left="567"/>
       </w:pPr>
       <w:r>
         <w:rPr>
           <w:rFonts w:ascii="Times New Roman" w:hAnsi="Times New Roman"/>
           <w:sz w:val="28"/>
         </w:rPr>
-        <w:t>9. Vite – Next Generation Frontend Tooling [Электронный ресурс]. – Режим доступа: https://vitejs.dev/</w:t>
+        <w:t>9. Vite – Next Generation Frontend Tooling [Электронный ресурс]. – https://vitejs.dev/</w:t>
       </w:r>
     </w:p>
     <w:p>
       <w:pPr>
-        <w:ind w:left="567" w:firstLine="0"/>
+        <w:ind w:left="567"/>
       </w:pPr>
       <w:r>
         <w:rPr>
           <w:rFonts w:ascii="Times New Roman" w:hAnsi="Times New Roman"/>
           <w:sz w:val="28"/>
         </w:rPr>
-        <w:t>10. Tailwind CSS – A utility-first CSS framework [Электронный ресурс]. – Режим доступа: https://tailwindcss.com/</w:t>
+        <w:t>10. Tailwind CSS – A utility-first CSS framework [Электронный ресурс]. – https://tailwindcss.com/</w:t>
       </w:r>
     </w:p>
     <w:p>
       <w:pPr>
-        <w:ind w:left="567" w:firstLine="0"/>
+        <w:ind w:left="567"/>
       </w:pPr>
       <w:r>
         <w:rPr>
           <w:rFonts w:ascii="Times New Roman" w:hAnsi="Times New Roman"/>
           <w:sz w:val="28"/>
         </w:rPr>
-        <w:t>11. Express – Fast, unopinionated, minimalist web framework for Node.js [Электронный ресурс]. – Режим доступа: https://expressjs.com/</w:t>
+        <w:t>11. Express – web framework for Node.js [Электронный ресурс]. – https://expressjs.com/</w:t>
       </w:r>
     </w:p>
     <w:p>
       <w:pPr>
-        <w:ind w:left="567" w:firstLine="0"/>
+        <w:ind w:left="567"/>
       </w:pPr>
       <w:r>
         <w:rPr>
           <w:rFonts w:ascii="Times New Roman" w:hAnsi="Times New Roman"/>
           <w:sz w:val="28"/>
         </w:rPr>
-        <w:t>12. PostgreSQL – The World's Most Advanced Open Source Relational Database [Электронный ресурс]. – Режим доступа: https://www.postgresql.org/</w:t>
+        <w:t>12. PostgreSQL – Open Source Relational Database [Электронный ресурс]. – https://www.postgresql.org/</w:t>
       </w:r>
     </w:p>
     <w:p>
       <w:pPr>
-        <w:ind w:left="567" w:firstLine="0"/>
+        <w:ind w:left="567"/>
       </w:pPr>
       <w:r>
         <w:rPr>
           <w:rFonts w:ascii="Times New Roman" w:hAnsi="Times New Roman"/>
           <w:sz w:val="28"/>
         </w:rPr>
-        <w:t>13. Drizzle ORM – TypeScript ORM for SQL databases [Электронный ресурс]. – Режим доступа: https://orm.drizzle.team/</w:t>
+        <w:t>13. Drizzle ORM – TypeScript ORM [Электронный ресурс]. – https://orm.drizzle.team/</w:t>
       </w:r>
     </w:p>
     <w:p>
       <w:pPr>
-        <w:ind w:left="567" w:firstLine="0"/>
+        <w:ind w:left="567"/>
       </w:pPr>
       <w:r>
         <w:rPr>
           <w:rFonts w:ascii="Times New Roman" w:hAnsi="Times New Roman"/>
           <w:sz w:val="28"/>
         </w:rPr>
-        <w:t>14. Monaco Editor – The Code Editor that Powers VS Code [Электронный ресурс]. – Режим доступа: https://microsoft.github.io/monaco-editor/</w:t>
+        <w:t>14. Monaco Editor – The Code Editor that Powers VS Code [Электронный ресурс]. – https://microsoft.github.io/monaco-editor/</w:t>
       </w:r>
     </w:p>
     <w:p>
       <w:pPr>
-        <w:ind w:left="567" w:firstLine="0"/>
+        <w:ind w:left="567"/>
       </w:pPr>
       <w:r>
         <w:rPr>
           <w:rFonts w:ascii="Times New Roman" w:hAnsi="Times New Roman"/>
           <w:sz w:val="28"/>
         </w:rPr>
-        <w:t>15. TypeScript – JavaScript with syntax for types [Электронный ресурс]. – Режим доступа: https://www.typescriptlang.org/</w:t>
+        <w:t>15. TypeScript – JavaScript with syntax for types [Электронный ресурс]. – https://www.typescriptlang.org/</w:t>
       </w:r>
     </w:p>
     <w:sectPr>
       <w:footerReference w:type="default" r:id="rId9"/>
       <w:pgSz w:w="11906" w:h="16838"/>
-      <w:pgMar w:top="850" w:right="850" w:bottom="1417" w:left="1701" w:header="720" w:footer="720" w:gutter="0"/>
+      <w:pgMar w:top="850" w:right="850" w:bottom="1984" w:left="1701" w:header="720" w:footer="720" w:gutter="0"/>
       <w:cols w:space="720"/>
       <w:docGrid w:linePitch="360"/>
       <w:pgBorders w:offsetFrom="page">
-        <w:top w:val="single" w:sz="6" w:space="25" w:color="000000"/>
-        <w:left w:val="single" w:sz="12" w:space="55" w:color="000000"/>
-        <w:bottom w:val="single" w:sz="6" w:space="25" w:color="000000"/>
-        <w:right w:val="single" w:sz="6" w:space="25" w:color="000000"/>
+        <w:top w:val="single" w:sz="6" w:space="20" w:color="000000"/>
+        <w:left w:val="single" w:sz="12" w:space="50" w:color="000000"/>
+        <w:bottom w:val="single" w:sz="6" w:space="20" w:color="000000"/>
+        <w:right w:val="single" w:sz="6" w:space="20" w:color="000000"/>
       </w:pgBorders>
     </w:sectPr>
   </w:body>
@@ -4669,26 +4697,30 @@
       <w:jc w:val="center"/>
       <w:tblLook w:firstColumn="1" w:firstRow="1" w:lastColumn="0" w:lastRow="0" w:noHBand="0" w:noVBand="1" w:val="04A0"/>
       <w:tblBorders>
-        <w:top w:val="single" w:sz="4" w:space="0" w:color="000000"/>
-        <w:left w:val="single" w:sz="4" w:space="0" w:color="000000"/>
-        <w:bottom w:val="single" w:sz="4" w:space="0" w:color="000000"/>
-        <w:right w:val="single" w:sz="4" w:space="0" w:color="000000"/>
+        <w:top w:val="single" w:sz="6" w:space="0" w:color="000000"/>
+        <w:left w:val="single" w:sz="6" w:space="0" w:color="000000"/>
+        <w:bottom w:val="single" w:sz="6" w:space="0" w:color="000000"/>
+        <w:right w:val="single" w:sz="6" w:space="0" w:color="000000"/>
         <w:insideH w:val="single" w:sz="4" w:space="0" w:color="000000"/>
         <w:insideV w:val="single" w:sz="4" w:space="0" w:color="000000"/>
       </w:tblBorders>
     </w:tblPr>
     <w:tblGrid>
-      <w:gridCol w:w="1559"/>
-      <w:gridCol w:w="1559"/>
-      <w:gridCol w:w="1559"/>
-      <w:gridCol w:w="1559"/>
-      <w:gridCol w:w="1559"/>
-      <w:gridCol w:w="1559"/>
+      <w:gridCol w:w="1336"/>
+      <w:gridCol w:w="1336"/>
+      <w:gridCol w:w="1336"/>
+      <w:gridCol w:w="1336"/>
+      <w:gridCol w:w="1336"/>
+      <w:gridCol w:w="1336"/>
+      <w:gridCol w:w="1336"/>
     </w:tblGrid>
     <w:tr>
+      <w:trPr>
+        <w:trHeight w:val="340" w:hRule="exact"/>
+      </w:trPr>
       <w:tc>
         <w:tcPr>
-          <w:tcW w:type="dxa" w:w="680"/>
+          <w:tcW w:type="dxa" w:w="567"/>
           <w:vAlign w:val="center"/>
         </w:tcPr>
         <w:p>
@@ -4706,7 +4738,7 @@
       </w:tc>
       <w:tc>
         <w:tcPr>
-          <w:tcW w:type="dxa" w:w="850"/>
+          <w:tcW w:type="dxa" w:w="567"/>
           <w:vAlign w:val="center"/>
         </w:tcPr>
         <w:p>
@@ -4724,7 +4756,7 @@
       </w:tc>
       <w:tc>
         <w:tcPr>
-          <w:tcW w:type="dxa" w:w="1134"/>
+          <w:tcW w:type="dxa" w:w="1020"/>
           <w:vAlign w:val="center"/>
         </w:tcPr>
         <w:p>
@@ -4760,7 +4792,7 @@
       </w:tc>
       <w:tc>
         <w:tcPr>
-          <w:tcW w:type="dxa" w:w="850"/>
+          <w:tcW w:type="dxa" w:w="680"/>
           <w:vAlign w:val="center"/>
         </w:tcPr>
         <w:p>
@@ -4778,7 +4810,7 @@
       </w:tc>
       <w:tc>
         <w:tcPr>
-          <w:tcW w:type="dxa" w:w="4989"/>
+          <w:tcW w:type="dxa" w:w="4252"/>
           <w:vAlign w:val="center"/>
         </w:tcPr>
         <w:p>
@@ -4790,27 +4822,13 @@
               <w:rFonts w:ascii="Times New Roman" w:hAnsi="Times New Roman"/>
               <w:sz w:val="16"/>
             </w:rPr>
-            <w:t>ВТ-416-01-25-ПЗ</w:t>
+            <w:t>09.02.07.06.001 ПЗ</w:t>
           </w:r>
-        </w:p>
-      </w:tc>
-    </w:tr>
-    <w:tr>
-      <w:tc>
-        <w:tcPr>
-          <w:tcW w:type="dxa" w:w="4364"/>
-          <w:gridSpan w:val="5"/>
-          <w:vAlign w:val="center"/>
-        </w:tcPr>
-        <w:p>
-          <w:pPr>
-            <w:jc w:val="center"/>
-          </w:pPr>
         </w:p>
       </w:tc>
       <w:tc>
         <w:tcPr>
-          <w:tcW w:type="dxa" w:w="4989"/>
+          <w:tcW w:type="dxa" w:w="1417"/>
           <w:vAlign w:val="center"/>
         </w:tcPr>
         <w:p>

</xml_diff>